<commit_message>
chore(micellia): deja solo el plan de negocios más nuevo (ago 2026)
- Conserva Documentos Micelia/Copia de Plan de Negocios Micelia_ Estrategia y Clientes.docx (modificado 2026-08-06, 112KB) como versión canónica
- Borra del tracking las 4 versiones viejas de julio (raíz + Documentos Micelia/)
- Suma assets nuevos: PDF DOC-20260527-WA0004..pdf y 4 imágenes de WhatsApp

Si algo falta en git, restaurar del histórico (las versiones borradas siguen en commits previos).
</commit_message>
<xml_diff>
--- a/Documentos Micelia/Copia de Plan de Negocios Micelia: Estrategia y Clientes.docx
+++ b/Documentos Micelia/Copia de Plan de Negocios Micelia: Estrategia y Clientes.docx
@@ -204,12 +204,12 @@
           <wp:inline distB="19050" distT="19050" distL="19050" distR="19050">
             <wp:extent cx="641549" cy="230958"/>
             <wp:effectExtent b="0" l="0" r="0" t="0"/>
-            <wp:docPr id="80" name="image70.png"/>
+            <wp:docPr id="80" name="image76.png"/>
             <a:graphic>
               <a:graphicData uri="http://schemas.openxmlformats.org/drawingml/2006/picture">
                 <pic:pic>
                   <pic:nvPicPr>
-                    <pic:cNvPr id="0" name="image70.png"/>
+                    <pic:cNvPr id="0" name="image76.png"/>
                     <pic:cNvPicPr preferRelativeResize="0"/>
                   </pic:nvPicPr>
                   <pic:blipFill>
@@ -250,12 +250,12 @@
           <wp:inline distB="19050" distT="19050" distL="19050" distR="19050">
             <wp:extent cx="641549" cy="230958"/>
             <wp:effectExtent b="0" l="0" r="0" t="0"/>
-            <wp:docPr id="82" name="image77.png"/>
+            <wp:docPr id="82" name="image62.png"/>
             <a:graphic>
               <a:graphicData uri="http://schemas.openxmlformats.org/drawingml/2006/picture">
                 <pic:pic>
                   <pic:nvPicPr>
-                    <pic:cNvPr id="0" name="image77.png"/>
+                    <pic:cNvPr id="0" name="image62.png"/>
                     <pic:cNvPicPr preferRelativeResize="0"/>
                   </pic:nvPicPr>
                   <pic:blipFill>
@@ -429,12 +429,12 @@
           <wp:inline distB="19050" distT="19050" distL="19050" distR="19050">
             <wp:extent cx="358775" cy="230641"/>
             <wp:effectExtent b="0" l="0" r="0" t="0"/>
-            <wp:docPr id="81" name="image63.png"/>
+            <wp:docPr id="81" name="image65.png"/>
             <a:graphic>
               <a:graphicData uri="http://schemas.openxmlformats.org/drawingml/2006/picture">
                 <pic:pic>
                   <pic:nvPicPr>
-                    <pic:cNvPr id="0" name="image63.png"/>
+                    <pic:cNvPr id="0" name="image65.png"/>
                     <pic:cNvPicPr preferRelativeResize="0"/>
                   </pic:nvPicPr>
                   <pic:blipFill>
@@ -475,12 +475,12 @@
           <wp:inline distB="19050" distT="19050" distL="19050" distR="19050">
             <wp:extent cx="358775" cy="230641"/>
             <wp:effectExtent b="0" l="0" r="0" t="0"/>
-            <wp:docPr id="84" name="image69.png"/>
+            <wp:docPr id="84" name="image68.png"/>
             <a:graphic>
               <a:graphicData uri="http://schemas.openxmlformats.org/drawingml/2006/picture">
                 <pic:pic>
                   <pic:nvPicPr>
-                    <pic:cNvPr id="0" name="image69.png"/>
+                    <pic:cNvPr id="0" name="image68.png"/>
                     <pic:cNvPicPr preferRelativeResize="0"/>
                   </pic:nvPicPr>
                   <pic:blipFill>
@@ -540,12 +540,12 @@
           <wp:inline distB="19050" distT="19050" distL="19050" distR="19050">
             <wp:extent cx="456605" cy="228302"/>
             <wp:effectExtent b="0" l="0" r="0" t="0"/>
-            <wp:docPr id="83" name="image19.png"/>
+            <wp:docPr id="83" name="image11.png"/>
             <a:graphic>
               <a:graphicData uri="http://schemas.openxmlformats.org/drawingml/2006/picture">
                 <pic:pic>
                   <pic:nvPicPr>
-                    <pic:cNvPr id="0" name="image19.png"/>
+                    <pic:cNvPr id="0" name="image11.png"/>
                     <pic:cNvPicPr preferRelativeResize="0"/>
                   </pic:nvPicPr>
                   <pic:blipFill>
@@ -651,12 +651,12 @@
           <wp:inline distB="19050" distT="19050" distL="19050" distR="19050">
             <wp:extent cx="583803" cy="233521"/>
             <wp:effectExtent b="0" l="0" r="0" t="0"/>
-            <wp:docPr id="87" name="image78.png"/>
+            <wp:docPr id="87" name="image59.png"/>
             <a:graphic>
               <a:graphicData uri="http://schemas.openxmlformats.org/drawingml/2006/picture">
                 <pic:pic>
                   <pic:nvPicPr>
-                    <pic:cNvPr id="0" name="image78.png"/>
+                    <pic:cNvPr id="0" name="image59.png"/>
                     <pic:cNvPicPr preferRelativeResize="0"/>
                   </pic:nvPicPr>
                   <pic:blipFill>
@@ -716,12 +716,12 @@
           <wp:inline distB="19050" distT="19050" distL="19050" distR="19050">
             <wp:extent cx="485973" cy="230198"/>
             <wp:effectExtent b="0" l="0" r="0" t="0"/>
-            <wp:docPr id="85" name="image5.png"/>
+            <wp:docPr id="85" name="image6.png"/>
             <a:graphic>
               <a:graphicData uri="http://schemas.openxmlformats.org/drawingml/2006/picture">
                 <pic:pic>
                   <pic:nvPicPr>
-                    <pic:cNvPr id="0" name="image5.png"/>
+                    <pic:cNvPr id="0" name="image6.png"/>
                     <pic:cNvPicPr preferRelativeResize="0"/>
                   </pic:nvPicPr>
                   <pic:blipFill>
@@ -1076,12 +1076,12 @@
           <wp:inline distB="19050" distT="19050" distL="19050" distR="19050">
             <wp:extent cx="381595" cy="241677"/>
             <wp:effectExtent b="0" l="0" r="0" t="0"/>
-            <wp:docPr id="91" name="image22.png"/>
+            <wp:docPr id="91" name="image20.png"/>
             <a:graphic>
               <a:graphicData uri="http://schemas.openxmlformats.org/drawingml/2006/picture">
                 <pic:pic>
                   <pic:nvPicPr>
-                    <pic:cNvPr id="0" name="image22.png"/>
+                    <pic:cNvPr id="0" name="image20.png"/>
                     <pic:cNvPicPr preferRelativeResize="0"/>
                   </pic:nvPicPr>
                   <pic:blipFill>
@@ -1161,12 +1161,12 @@
           <wp:inline distB="19050" distT="19050" distL="19050" distR="19050">
             <wp:extent cx="494507" cy="228234"/>
             <wp:effectExtent b="0" l="0" r="0" t="0"/>
-            <wp:docPr id="89" name="image27.png"/>
+            <wp:docPr id="89" name="image34.png"/>
             <a:graphic>
               <a:graphicData uri="http://schemas.openxmlformats.org/drawingml/2006/picture">
                 <pic:pic>
                   <pic:nvPicPr>
-                    <pic:cNvPr id="0" name="image27.png"/>
+                    <pic:cNvPr id="0" name="image34.png"/>
                     <pic:cNvPicPr preferRelativeResize="0"/>
                   </pic:nvPicPr>
                   <pic:blipFill>
@@ -1321,12 +1321,12 @@
           <wp:inline distB="19050" distT="19050" distL="19050" distR="19050">
             <wp:extent cx="929481" cy="229187"/>
             <wp:effectExtent b="0" l="0" r="0" t="0"/>
-            <wp:docPr id="96" name="image7.png"/>
+            <wp:docPr id="96" name="image18.png"/>
             <a:graphic>
               <a:graphicData uri="http://schemas.openxmlformats.org/drawingml/2006/picture">
                 <pic:pic>
                   <pic:nvPicPr>
-                    <pic:cNvPr id="0" name="image7.png"/>
+                    <pic:cNvPr id="0" name="image18.png"/>
                     <pic:cNvPicPr preferRelativeResize="0"/>
                   </pic:nvPicPr>
                   <pic:blipFill>
@@ -1514,6 +1514,7 @@
         <w:shd w:fill="auto" w:val="clear"/>
         <w:spacing w:line="275.9999942779541" w:lineRule="auto"/>
         <w:ind w:left="590.3999984264374" w:hanging="360"/>
+        <w:rPr/>
       </w:pPr>
       <w:r>
         <w:rPr>
@@ -1542,12 +1543,12 @@
           <wp:inline distB="19050" distT="19050" distL="19050" distR="19050">
             <wp:extent cx="415330" cy="226544"/>
             <wp:effectExtent b="0" l="0" r="0" t="0"/>
-            <wp:docPr id="93" name="image80.png"/>
+            <wp:docPr id="93" name="image67.png"/>
             <a:graphic>
               <a:graphicData uri="http://schemas.openxmlformats.org/drawingml/2006/picture">
                 <pic:pic>
                   <pic:nvPicPr>
-                    <pic:cNvPr id="0" name="image80.png"/>
+                    <pic:cNvPr id="0" name="image67.png"/>
                     <pic:cNvPicPr preferRelativeResize="0"/>
                   </pic:nvPicPr>
                   <pic:blipFill>
@@ -1588,12 +1589,12 @@
           <wp:inline distB="19050" distT="19050" distL="19050" distR="19050">
             <wp:extent cx="415330" cy="226544"/>
             <wp:effectExtent b="0" l="0" r="0" t="0"/>
-            <wp:docPr id="95" name="image71.png"/>
+            <wp:docPr id="95" name="image75.png"/>
             <a:graphic>
               <a:graphicData uri="http://schemas.openxmlformats.org/drawingml/2006/picture">
                 <pic:pic>
                   <pic:nvPicPr>
-                    <pic:cNvPr id="0" name="image71.png"/>
+                    <pic:cNvPr id="0" name="image75.png"/>
                     <pic:cNvPicPr preferRelativeResize="0"/>
                   </pic:nvPicPr>
                   <pic:blipFill>
@@ -1653,12 +1654,12 @@
           <wp:inline distB="19050" distT="19050" distL="19050" distR="19050">
             <wp:extent cx="415330" cy="226544"/>
             <wp:effectExtent b="0" l="0" r="0" t="0"/>
-            <wp:docPr id="98" name="image75.png"/>
+            <wp:docPr id="98" name="image73.png"/>
             <a:graphic>
               <a:graphicData uri="http://schemas.openxmlformats.org/drawingml/2006/picture">
                 <pic:pic>
                   <pic:nvPicPr>
-                    <pic:cNvPr id="0" name="image75.png"/>
+                    <pic:cNvPr id="0" name="image73.png"/>
                     <pic:cNvPicPr preferRelativeResize="0"/>
                   </pic:nvPicPr>
                   <pic:blipFill>
@@ -1699,12 +1700,12 @@
           <wp:inline distB="19050" distT="19050" distL="19050" distR="19050">
             <wp:extent cx="415330" cy="226544"/>
             <wp:effectExtent b="0" l="0" r="0" t="0"/>
-            <wp:docPr id="99" name="image80.png"/>
+            <wp:docPr id="99" name="image67.png"/>
             <a:graphic>
               <a:graphicData uri="http://schemas.openxmlformats.org/drawingml/2006/picture">
                 <pic:pic>
                   <pic:nvPicPr>
-                    <pic:cNvPr id="0" name="image80.png"/>
+                    <pic:cNvPr id="0" name="image67.png"/>
                     <pic:cNvPicPr preferRelativeResize="0"/>
                   </pic:nvPicPr>
                   <pic:blipFill>
@@ -1747,6 +1748,11 @@
         </w:rPr>
         <w:t xml:space="preserve">2</w:t>
       </w:r>
+      <w:r>
+        <w:rPr>
+          <w:rtl w:val="0"/>
+        </w:rPr>
+      </w:r>
     </w:p>
     <w:p>
       <w:pPr>
@@ -1764,6 +1770,7 @@
         <w:shd w:fill="auto" w:val="clear"/>
         <w:spacing w:line="275.9999942779541" w:lineRule="auto"/>
         <w:ind w:left="590.3999984264374" w:hanging="360"/>
+        <w:rPr/>
       </w:pPr>
       <w:r>
         <w:rPr>
@@ -1792,12 +1799,12 @@
           <wp:inline distB="19050" distT="19050" distL="19050" distR="19050">
             <wp:extent cx="358775" cy="230641"/>
             <wp:effectExtent b="0" l="0" r="0" t="0"/>
-            <wp:docPr id="100" name="image73.png"/>
+            <wp:docPr id="100" name="image78.png"/>
             <a:graphic>
               <a:graphicData uri="http://schemas.openxmlformats.org/drawingml/2006/picture">
                 <pic:pic>
                   <pic:nvPicPr>
-                    <pic:cNvPr id="0" name="image73.png"/>
+                    <pic:cNvPr id="0" name="image78.png"/>
                     <pic:cNvPicPr preferRelativeResize="0"/>
                   </pic:nvPicPr>
                   <pic:blipFill>
@@ -1903,12 +1910,12 @@
           <wp:inline distB="19050" distT="19050" distL="19050" distR="19050">
             <wp:extent cx="358775" cy="230641"/>
             <wp:effectExtent b="0" l="0" r="0" t="0"/>
-            <wp:docPr id="102" name="image81.png"/>
+            <wp:docPr id="102" name="image72.png"/>
             <a:graphic>
               <a:graphicData uri="http://schemas.openxmlformats.org/drawingml/2006/picture">
                 <pic:pic>
                   <pic:nvPicPr>
-                    <pic:cNvPr id="0" name="image81.png"/>
+                    <pic:cNvPr id="0" name="image72.png"/>
                     <pic:cNvPicPr preferRelativeResize="0"/>
                   </pic:nvPicPr>
                   <pic:blipFill>
@@ -1968,12 +1975,12 @@
           <wp:inline distB="19050" distT="19050" distL="19050" distR="19050">
             <wp:extent cx="456605" cy="228302"/>
             <wp:effectExtent b="0" l="0" r="0" t="0"/>
-            <wp:docPr id="103" name="image19.png"/>
+            <wp:docPr id="103" name="image11.png"/>
             <a:graphic>
               <a:graphicData uri="http://schemas.openxmlformats.org/drawingml/2006/picture">
                 <pic:pic>
                   <pic:nvPicPr>
-                    <pic:cNvPr id="0" name="image19.png"/>
+                    <pic:cNvPr id="0" name="image11.png"/>
                     <pic:cNvPicPr preferRelativeResize="0"/>
                   </pic:nvPicPr>
                   <pic:blipFill>
@@ -2016,6 +2023,11 @@
         </w:rPr>
         <w:t xml:space="preserve">2</w:t>
       </w:r>
+      <w:r>
+        <w:rPr>
+          <w:rtl w:val="0"/>
+        </w:rPr>
+      </w:r>
     </w:p>
     <w:p>
       <w:pPr>
@@ -2033,6 +2045,7 @@
         <w:shd w:fill="auto" w:val="clear"/>
         <w:spacing w:line="275.9999942779541" w:lineRule="auto"/>
         <w:ind w:left="590.3999984264374" w:hanging="360"/>
+        <w:rPr/>
       </w:pPr>
       <w:r>
         <w:rPr>
@@ -2055,12 +2068,12 @@
           <wp:inline distB="19050" distT="19050" distL="19050" distR="19050">
             <wp:extent cx="381595" cy="241677"/>
             <wp:effectExtent b="0" l="0" r="0" t="0"/>
-            <wp:docPr id="104" name="image22.png"/>
+            <wp:docPr id="104" name="image20.png"/>
             <a:graphic>
               <a:graphicData uri="http://schemas.openxmlformats.org/drawingml/2006/picture">
                 <pic:pic>
                   <pic:nvPicPr>
-                    <pic:cNvPr id="0" name="image22.png"/>
+                    <pic:cNvPr id="0" name="image20.png"/>
                     <pic:cNvPicPr preferRelativeResize="0"/>
                   </pic:nvPicPr>
                   <pic:blipFill>
@@ -2111,12 +2124,12 @@
           <wp:inline distB="19050" distT="19050" distL="19050" distR="19050">
             <wp:extent cx="381595" cy="241677"/>
             <wp:effectExtent b="0" l="0" r="0" t="0"/>
-            <wp:docPr id="105" name="image22.png"/>
+            <wp:docPr id="105" name="image20.png"/>
             <a:graphic>
               <a:graphicData uri="http://schemas.openxmlformats.org/drawingml/2006/picture">
                 <pic:pic>
                   <pic:nvPicPr>
-                    <pic:cNvPr id="0" name="image22.png"/>
+                    <pic:cNvPr id="0" name="image20.png"/>
                     <pic:cNvPicPr preferRelativeResize="0"/>
                   </pic:nvPicPr>
                   <pic:blipFill>
@@ -2176,12 +2189,12 @@
           <wp:inline distB="19050" distT="19050" distL="19050" distR="19050">
             <wp:extent cx="381595" cy="241677"/>
             <wp:effectExtent b="0" l="0" r="0" t="0"/>
-            <wp:docPr id="70" name="image22.png"/>
+            <wp:docPr id="70" name="image20.png"/>
             <a:graphic>
               <a:graphicData uri="http://schemas.openxmlformats.org/drawingml/2006/picture">
                 <pic:pic>
                   <pic:nvPicPr>
-                    <pic:cNvPr id="0" name="image22.png"/>
+                    <pic:cNvPr id="0" name="image20.png"/>
                     <pic:cNvPicPr preferRelativeResize="0"/>
                   </pic:nvPicPr>
                   <pic:blipFill>
@@ -2222,12 +2235,12 @@
           <wp:inline distB="19050" distT="19050" distL="19050" distR="19050">
             <wp:extent cx="820936" cy="230888"/>
             <wp:effectExtent b="0" l="0" r="0" t="0"/>
-            <wp:docPr id="71" name="image58.png"/>
+            <wp:docPr id="71" name="image53.png"/>
             <a:graphic>
               <a:graphicData uri="http://schemas.openxmlformats.org/drawingml/2006/picture">
                 <pic:pic>
                   <pic:nvPicPr>
-                    <pic:cNvPr id="0" name="image58.png"/>
+                    <pic:cNvPr id="0" name="image53.png"/>
                     <pic:cNvPicPr preferRelativeResize="0"/>
                   </pic:nvPicPr>
                   <pic:blipFill>
@@ -2270,6 +2283,11 @@
         </w:rPr>
         <w:t xml:space="preserve">2</w:t>
       </w:r>
+      <w:r>
+        <w:rPr>
+          <w:rtl w:val="0"/>
+        </w:rPr>
+      </w:r>
     </w:p>
     <w:p>
       <w:pPr>
@@ -2287,6 +2305,7 @@
         <w:shd w:fill="auto" w:val="clear"/>
         <w:spacing w:line="275.9999942779541" w:lineRule="auto"/>
         <w:ind w:left="590.3999984264374" w:hanging="360"/>
+        <w:rPr/>
       </w:pPr>
       <w:r>
         <w:rPr>
@@ -2315,12 +2334,12 @@
           <wp:inline distB="19050" distT="19050" distL="19050" distR="19050">
             <wp:extent cx="195660" cy="234792"/>
             <wp:effectExtent b="0" l="0" r="0" t="0"/>
-            <wp:docPr id="72" name="image55.png"/>
+            <wp:docPr id="72" name="image81.png"/>
             <a:graphic>
               <a:graphicData uri="http://schemas.openxmlformats.org/drawingml/2006/picture">
                 <pic:pic>
                   <pic:nvPicPr>
-                    <pic:cNvPr id="0" name="image55.png"/>
+                    <pic:cNvPr id="0" name="image81.png"/>
                     <pic:cNvPicPr preferRelativeResize="0"/>
                   </pic:nvPicPr>
                   <pic:blipFill>
@@ -2361,12 +2380,12 @@
           <wp:inline distB="19050" distT="19050" distL="19050" distR="19050">
             <wp:extent cx="676870" cy="229880"/>
             <wp:effectExtent b="0" l="0" r="0" t="0"/>
-            <wp:docPr id="73" name="image66.png"/>
+            <wp:docPr id="73" name="image64.png"/>
             <a:graphic>
               <a:graphicData uri="http://schemas.openxmlformats.org/drawingml/2006/picture">
                 <pic:pic>
                   <pic:nvPicPr>
-                    <pic:cNvPr id="0" name="image66.png"/>
+                    <pic:cNvPr id="0" name="image64.png"/>
                     <pic:cNvPicPr preferRelativeResize="0"/>
                   </pic:nvPicPr>
                   <pic:blipFill>
@@ -2408,6 +2427,11 @@
           <w:rtl w:val="0"/>
         </w:rPr>
         <w:t xml:space="preserve">2</w:t>
+      </w:r>
+      <w:r>
+        <w:rPr>
+          <w:rtl w:val="0"/>
+        </w:rPr>
       </w:r>
     </w:p>
     <w:p>
@@ -2724,12 +2748,12 @@
           <wp:inline distB="19050" distT="19050" distL="19050" distR="19050">
             <wp:extent cx="413345" cy="232507"/>
             <wp:effectExtent b="0" l="0" r="0" t="0"/>
-            <wp:docPr id="74" name="image65.png"/>
+            <wp:docPr id="74" name="image60.png"/>
             <a:graphic>
               <a:graphicData uri="http://schemas.openxmlformats.org/drawingml/2006/picture">
                 <pic:pic>
                   <pic:nvPicPr>
-                    <pic:cNvPr id="0" name="image65.png"/>
+                    <pic:cNvPr id="0" name="image60.png"/>
                     <pic:cNvPicPr preferRelativeResize="0"/>
                   </pic:nvPicPr>
                   <pic:blipFill>
@@ -2770,12 +2794,12 @@
           <wp:inline distB="19050" distT="19050" distL="19050" distR="19050">
             <wp:extent cx="622300" cy="233362"/>
             <wp:effectExtent b="0" l="0" r="0" t="0"/>
-            <wp:docPr id="75" name="image59.png"/>
+            <wp:docPr id="75" name="image61.png"/>
             <a:graphic>
               <a:graphicData uri="http://schemas.openxmlformats.org/drawingml/2006/picture">
                 <pic:pic>
                   <pic:nvPicPr>
-                    <pic:cNvPr id="0" name="image59.png"/>
+                    <pic:cNvPr id="0" name="image61.png"/>
                     <pic:cNvPicPr preferRelativeResize="0"/>
                   </pic:nvPicPr>
                   <pic:blipFill>
@@ -2835,12 +2859,12 @@
           <wp:inline distB="19050" distT="19050" distL="19050" distR="19050">
             <wp:extent cx="290314" cy="237530"/>
             <wp:effectExtent b="0" l="0" r="0" t="0"/>
-            <wp:docPr id="76" name="image64.png"/>
+            <wp:docPr id="76" name="image70.png"/>
             <a:graphic>
               <a:graphicData uri="http://schemas.openxmlformats.org/drawingml/2006/picture">
                 <pic:pic>
                   <pic:nvPicPr>
-                    <pic:cNvPr id="0" name="image64.png"/>
+                    <pic:cNvPr id="0" name="image70.png"/>
                     <pic:cNvPicPr preferRelativeResize="0"/>
                   </pic:nvPicPr>
                   <pic:blipFill>
@@ -2881,12 +2905,12 @@
           <wp:inline distB="19050" distT="19050" distL="19050" distR="19050">
             <wp:extent cx="405408" cy="240711"/>
             <wp:effectExtent b="0" l="0" r="0" t="0"/>
-            <wp:docPr id="77" name="image67.png"/>
+            <wp:docPr id="77" name="image71.png"/>
             <a:graphic>
               <a:graphicData uri="http://schemas.openxmlformats.org/drawingml/2006/picture">
                 <pic:pic>
                   <pic:nvPicPr>
-                    <pic:cNvPr id="0" name="image67.png"/>
+                    <pic:cNvPr id="0" name="image71.png"/>
                     <pic:cNvPicPr preferRelativeResize="0"/>
                   </pic:nvPicPr>
                   <pic:blipFill>
@@ -2927,12 +2951,12 @@
           <wp:inline distB="19050" distT="19050" distL="19050" distR="19050">
             <wp:extent cx="405408" cy="240711"/>
             <wp:effectExtent b="0" l="0" r="0" t="0"/>
-            <wp:docPr id="78" name="image62.png"/>
+            <wp:docPr id="78" name="image57.png"/>
             <a:graphic>
               <a:graphicData uri="http://schemas.openxmlformats.org/drawingml/2006/picture">
                 <pic:pic>
                   <pic:nvPicPr>
-                    <pic:cNvPr id="0" name="image62.png"/>
+                    <pic:cNvPr id="0" name="image57.png"/>
                     <pic:cNvPicPr preferRelativeResize="0"/>
                   </pic:nvPicPr>
                   <pic:blipFill>
@@ -3094,6 +3118,7 @@
         <w:shd w:fill="auto" w:val="clear"/>
         <w:spacing w:line="275.9999942779541" w:lineRule="auto"/>
         <w:ind w:left="590.3999984264374" w:hanging="360"/>
+        <w:rPr/>
       </w:pPr>
       <w:r>
         <w:rPr>
@@ -3122,12 +3147,12 @@
           <wp:inline distB="19050" distT="19050" distL="19050" distR="19050">
             <wp:extent cx="358775" cy="230641"/>
             <wp:effectExtent b="0" l="0" r="0" t="0"/>
-            <wp:docPr id="79" name="image68.png"/>
+            <wp:docPr id="79" name="image74.png"/>
             <a:graphic>
               <a:graphicData uri="http://schemas.openxmlformats.org/drawingml/2006/picture">
                 <pic:pic>
                   <pic:nvPicPr>
-                    <pic:cNvPr id="0" name="image68.png"/>
+                    <pic:cNvPr id="0" name="image74.png"/>
                     <pic:cNvPicPr preferRelativeResize="0"/>
                   </pic:nvPicPr>
                   <pic:blipFill>
@@ -3168,12 +3193,12 @@
           <wp:inline distB="19050" distT="19050" distL="19050" distR="19050">
             <wp:extent cx="97829" cy="251561"/>
             <wp:effectExtent b="0" l="0" r="0" t="0"/>
-            <wp:docPr id="15" name="image3.png"/>
+            <wp:docPr id="15" name="image29.png"/>
             <a:graphic>
               <a:graphicData uri="http://schemas.openxmlformats.org/drawingml/2006/picture">
                 <pic:pic>
                   <pic:nvPicPr>
-                    <pic:cNvPr id="0" name="image3.png"/>
+                    <pic:cNvPr id="0" name="image29.png"/>
                     <pic:cNvPicPr preferRelativeResize="0"/>
                   </pic:nvPicPr>
                   <pic:blipFill>
@@ -3214,12 +3239,12 @@
           <wp:inline distB="19050" distT="19050" distL="19050" distR="19050">
             <wp:extent cx="428030" cy="246441"/>
             <wp:effectExtent b="0" l="0" r="0" t="0"/>
-            <wp:docPr id="17" name="image4.png"/>
+            <wp:docPr id="17" name="image26.png"/>
             <a:graphic>
               <a:graphicData uri="http://schemas.openxmlformats.org/drawingml/2006/picture">
                 <pic:pic>
                   <pic:nvPicPr>
-                    <pic:cNvPr id="0" name="image4.png"/>
+                    <pic:cNvPr id="0" name="image26.png"/>
                     <pic:cNvPicPr preferRelativeResize="0"/>
                   </pic:nvPicPr>
                   <pic:blipFill>
@@ -3279,12 +3304,12 @@
           <wp:inline distB="19050" distT="19050" distL="19050" distR="19050">
             <wp:extent cx="358775" cy="230641"/>
             <wp:effectExtent b="0" l="0" r="0" t="0"/>
-            <wp:docPr id="18" name="image1.png"/>
+            <wp:docPr id="18" name="image36.png"/>
             <a:graphic>
               <a:graphicData uri="http://schemas.openxmlformats.org/drawingml/2006/picture">
                 <pic:pic>
                   <pic:nvPicPr>
-                    <pic:cNvPr id="0" name="image1.png"/>
+                    <pic:cNvPr id="0" name="image36.png"/>
                     <pic:cNvPicPr preferRelativeResize="0"/>
                   </pic:nvPicPr>
                   <pic:blipFill>
@@ -3327,6 +3352,11 @@
         </w:rPr>
         <w:t xml:space="preserve">2</w:t>
       </w:r>
+      <w:r>
+        <w:rPr>
+          <w:rtl w:val="0"/>
+        </w:rPr>
+      </w:r>
     </w:p>
     <w:p>
       <w:pPr>
@@ -3344,6 +3374,7 @@
         <w:shd w:fill="auto" w:val="clear"/>
         <w:spacing w:line="275.9999942779541" w:lineRule="auto"/>
         <w:ind w:left="590.3999984264374" w:hanging="360"/>
+        <w:rPr/>
       </w:pPr>
       <w:r>
         <w:rPr>
@@ -3357,12 +3388,12 @@
           <wp:inline distB="19050" distT="19050" distL="19050" distR="19050">
             <wp:extent cx="381595" cy="241677"/>
             <wp:effectExtent b="0" l="0" r="0" t="0"/>
-            <wp:docPr id="19" name="image22.png"/>
+            <wp:docPr id="19" name="image20.png"/>
             <a:graphic>
               <a:graphicData uri="http://schemas.openxmlformats.org/drawingml/2006/picture">
                 <pic:pic>
                   <pic:nvPicPr>
-                    <pic:cNvPr id="0" name="image22.png"/>
+                    <pic:cNvPr id="0" name="image20.png"/>
                     <pic:cNvPicPr preferRelativeResize="0"/>
                   </pic:nvPicPr>
                   <pic:blipFill>
@@ -3415,6 +3446,11 @@
         </w:rPr>
         <w:t xml:space="preserve">16</w:t>
       </w:r>
+      <w:r>
+        <w:rPr>
+          <w:rtl w:val="0"/>
+        </w:rPr>
+      </w:r>
     </w:p>
     <w:p>
       <w:pPr>
@@ -3432,6 +3468,7 @@
         <w:shd w:fill="auto" w:val="clear"/>
         <w:spacing w:line="275.9999942779541" w:lineRule="auto"/>
         <w:ind w:left="590.3999984264374" w:hanging="360"/>
+        <w:rPr/>
       </w:pPr>
       <w:r>
         <w:rPr>
@@ -3461,6 +3498,11 @@
           <w:rtl w:val="0"/>
         </w:rPr>
         <w:t xml:space="preserve">2</w:t>
+      </w:r>
+      <w:r>
+        <w:rPr>
+          <w:rtl w:val="0"/>
+        </w:rPr>
       </w:r>
     </w:p>
     <w:p>
@@ -3993,6 +4035,7 @@
         <w:shd w:fill="auto" w:val="clear"/>
         <w:spacing w:line="275.9999942779541" w:lineRule="auto"/>
         <w:ind w:left="600" w:hanging="360"/>
+        <w:rPr/>
       </w:pPr>
       <w:r>
         <w:rPr>
@@ -4021,12 +4064,12 @@
           <wp:inline distB="19050" distT="19050" distL="19050" distR="19050">
             <wp:extent cx="842565" cy="229791"/>
             <wp:effectExtent b="0" l="0" r="0" t="0"/>
-            <wp:docPr id="20" name="image6.png"/>
+            <wp:docPr id="20" name="image9.png"/>
             <a:graphic>
               <a:graphicData uri="http://schemas.openxmlformats.org/drawingml/2006/picture">
                 <pic:pic>
                   <pic:nvPicPr>
-                    <pic:cNvPr id="0" name="image6.png"/>
+                    <pic:cNvPr id="0" name="image9.png"/>
                     <pic:cNvPicPr preferRelativeResize="0"/>
                   </pic:nvPicPr>
                   <pic:blipFill>
@@ -4088,6 +4131,11 @@
         </w:rPr>
         <w:t xml:space="preserve">19</w:t>
       </w:r>
+      <w:r>
+        <w:rPr>
+          <w:rtl w:val="0"/>
+        </w:rPr>
+      </w:r>
     </w:p>
     <w:p>
       <w:pPr>
@@ -4105,6 +4153,7 @@
         <w:shd w:fill="auto" w:val="clear"/>
         <w:spacing w:line="275.9999942779541" w:lineRule="auto"/>
         <w:ind w:left="600" w:hanging="360"/>
+        <w:rPr/>
       </w:pPr>
       <w:r>
         <w:rPr>
@@ -4152,12 +4201,12 @@
           <wp:inline distB="19050" distT="19050" distL="19050" distR="19050">
             <wp:extent cx="768747" cy="230624"/>
             <wp:effectExtent b="0" l="0" r="0" t="0"/>
-            <wp:docPr id="21" name="image20.png"/>
+            <wp:docPr id="21" name="image12.png"/>
             <a:graphic>
               <a:graphicData uri="http://schemas.openxmlformats.org/drawingml/2006/picture">
                 <pic:pic>
                   <pic:nvPicPr>
-                    <pic:cNvPr id="0" name="image20.png"/>
+                    <pic:cNvPr id="0" name="image12.png"/>
                     <pic:cNvPicPr preferRelativeResize="0"/>
                   </pic:nvPicPr>
                   <pic:blipFill>
@@ -4198,12 +4247,12 @@
           <wp:inline distB="19050" distT="19050" distL="19050" distR="19050">
             <wp:extent cx="757039" cy="230961"/>
             <wp:effectExtent b="0" l="0" r="0" t="0"/>
-            <wp:docPr id="22" name="image23.png"/>
+            <wp:docPr id="22" name="image27.png"/>
             <a:graphic>
               <a:graphicData uri="http://schemas.openxmlformats.org/drawingml/2006/picture">
                 <pic:pic>
                   <pic:nvPicPr>
-                    <pic:cNvPr id="0" name="image23.png"/>
+                    <pic:cNvPr id="0" name="image27.png"/>
                     <pic:cNvPicPr preferRelativeResize="0"/>
                   </pic:nvPicPr>
                   <pic:blipFill>
@@ -4244,12 +4293,12 @@
           <wp:inline distB="19050" distT="19050" distL="19050" distR="19050">
             <wp:extent cx="681236" cy="227079"/>
             <wp:effectExtent b="0" l="0" r="0" t="0"/>
-            <wp:docPr id="23" name="image26.png"/>
+            <wp:docPr id="23" name="image31.png"/>
             <a:graphic>
               <a:graphicData uri="http://schemas.openxmlformats.org/drawingml/2006/picture">
                 <pic:pic>
                   <pic:nvPicPr>
-                    <pic:cNvPr id="0" name="image26.png"/>
+                    <pic:cNvPr id="0" name="image31.png"/>
                     <pic:cNvPicPr preferRelativeResize="0"/>
                   </pic:nvPicPr>
                   <pic:blipFill>
@@ -4309,12 +4358,12 @@
           <wp:inline distB="19050" distT="19050" distL="19050" distR="19050">
             <wp:extent cx="712391" cy="228983"/>
             <wp:effectExtent b="0" l="0" r="0" t="0"/>
-            <wp:docPr id="24" name="image41.png"/>
+            <wp:docPr id="24" name="image14.png"/>
             <a:graphic>
               <a:graphicData uri="http://schemas.openxmlformats.org/drawingml/2006/picture">
                 <pic:pic>
                   <pic:nvPicPr>
-                    <pic:cNvPr id="0" name="image41.png"/>
+                    <pic:cNvPr id="0" name="image14.png"/>
                     <pic:cNvPicPr preferRelativeResize="0"/>
                   </pic:nvPicPr>
                   <pic:blipFill>
@@ -4376,6 +4425,11 @@
         </w:rPr>
         <w:t xml:space="preserve">13</w:t>
       </w:r>
+      <w:r>
+        <w:rPr>
+          <w:rtl w:val="0"/>
+        </w:rPr>
+      </w:r>
     </w:p>
     <w:p>
       <w:pPr>
@@ -4393,6 +4447,7 @@
         <w:shd w:fill="auto" w:val="clear"/>
         <w:spacing w:line="275.9999942779541" w:lineRule="auto"/>
         <w:ind w:left="600" w:hanging="360"/>
+        <w:rPr/>
       </w:pPr>
       <w:r>
         <w:rPr>
@@ -4421,12 +4476,12 @@
           <wp:inline distB="19050" distT="19050" distL="19050" distR="19050">
             <wp:extent cx="696118" cy="232039"/>
             <wp:effectExtent b="0" l="0" r="0" t="0"/>
-            <wp:docPr id="25" name="image21.png"/>
+            <wp:docPr id="25" name="image35.png"/>
             <a:graphic>
               <a:graphicData uri="http://schemas.openxmlformats.org/drawingml/2006/picture">
                 <pic:pic>
                   <pic:nvPicPr>
-                    <pic:cNvPr id="0" name="image21.png"/>
+                    <pic:cNvPr id="0" name="image35.png"/>
                     <pic:cNvPicPr preferRelativeResize="0"/>
                   </pic:nvPicPr>
                   <pic:blipFill>
@@ -4486,12 +4541,12 @@
           <wp:inline distB="19050" distT="19050" distL="19050" distR="19050">
             <wp:extent cx="358775" cy="230641"/>
             <wp:effectExtent b="0" l="0" r="0" t="0"/>
-            <wp:docPr id="1" name="image14.png"/>
+            <wp:docPr id="1" name="image5.png"/>
             <a:graphic>
               <a:graphicData uri="http://schemas.openxmlformats.org/drawingml/2006/picture">
                 <pic:pic>
                   <pic:nvPicPr>
-                    <pic:cNvPr id="0" name="image14.png"/>
+                    <pic:cNvPr id="0" name="image5.png"/>
                     <pic:cNvPicPr preferRelativeResize="0"/>
                   </pic:nvPicPr>
                   <pic:blipFill>
@@ -4532,12 +4587,12 @@
           <wp:inline distB="19050" distT="19050" distL="19050" distR="19050">
             <wp:extent cx="358775" cy="230641"/>
             <wp:effectExtent b="0" l="0" r="0" t="0"/>
-            <wp:docPr id="2" name="image11.png"/>
+            <wp:docPr id="2" name="image19.png"/>
             <a:graphic>
               <a:graphicData uri="http://schemas.openxmlformats.org/drawingml/2006/picture">
                 <pic:pic>
                   <pic:nvPicPr>
-                    <pic:cNvPr id="0" name="image11.png"/>
+                    <pic:cNvPr id="0" name="image19.png"/>
                     <pic:cNvPicPr preferRelativeResize="0"/>
                   </pic:nvPicPr>
                   <pic:blipFill>
@@ -4599,6 +4654,11 @@
         </w:rPr>
         <w:t xml:space="preserve">19</w:t>
       </w:r>
+      <w:r>
+        <w:rPr>
+          <w:rtl w:val="0"/>
+        </w:rPr>
+      </w:r>
     </w:p>
     <w:p>
       <w:pPr>
@@ -4616,6 +4676,7 @@
         <w:shd w:fill="auto" w:val="clear"/>
         <w:spacing w:line="275.9999942779541" w:lineRule="auto"/>
         <w:ind w:left="600" w:hanging="360"/>
+        <w:rPr/>
       </w:pPr>
       <w:r>
         <w:rPr>
@@ -4644,12 +4705,12 @@
           <wp:inline distB="19050" distT="19050" distL="19050" distR="19050">
             <wp:extent cx="260945" cy="234850"/>
             <wp:effectExtent b="0" l="0" r="0" t="0"/>
-            <wp:docPr id="3" name="image2.png"/>
+            <wp:docPr id="3" name="image4.png"/>
             <a:graphic>
               <a:graphicData uri="http://schemas.openxmlformats.org/drawingml/2006/picture">
                 <pic:pic>
                   <pic:nvPicPr>
-                    <pic:cNvPr id="0" name="image2.png"/>
+                    <pic:cNvPr id="0" name="image4.png"/>
                     <pic:cNvPicPr preferRelativeResize="0"/>
                   </pic:nvPicPr>
                   <pic:blipFill>
@@ -4690,12 +4751,12 @@
           <wp:inline distB="19050" distT="19050" distL="19050" distR="19050">
             <wp:extent cx="358775" cy="230641"/>
             <wp:effectExtent b="0" l="0" r="0" t="0"/>
-            <wp:docPr id="4" name="image18.png"/>
+            <wp:docPr id="4" name="image16.png"/>
             <a:graphic>
               <a:graphicData uri="http://schemas.openxmlformats.org/drawingml/2006/picture">
                 <pic:pic>
                   <pic:nvPicPr>
-                    <pic:cNvPr id="0" name="image18.png"/>
+                    <pic:cNvPr id="0" name="image16.png"/>
                     <pic:cNvPicPr preferRelativeResize="0"/>
                   </pic:nvPicPr>
                   <pic:blipFill>
@@ -4736,12 +4797,12 @@
           <wp:inline distB="19050" distT="19050" distL="19050" distR="19050">
             <wp:extent cx="929481" cy="229187"/>
             <wp:effectExtent b="0" l="0" r="0" t="0"/>
-            <wp:docPr id="5" name="image12.png"/>
+            <wp:docPr id="5" name="image1.png"/>
             <a:graphic>
               <a:graphicData uri="http://schemas.openxmlformats.org/drawingml/2006/picture">
                 <pic:pic>
                   <pic:nvPicPr>
-                    <pic:cNvPr id="0" name="image12.png"/>
+                    <pic:cNvPr id="0" name="image1.png"/>
                     <pic:cNvPicPr preferRelativeResize="0"/>
                   </pic:nvPicPr>
                   <pic:blipFill>
@@ -4782,12 +4843,12 @@
           <wp:inline distB="19050" distT="19050" distL="19050" distR="19050">
             <wp:extent cx="348060" cy="232040"/>
             <wp:effectExtent b="0" l="0" r="0" t="0"/>
-            <wp:docPr id="6" name="image16.png"/>
+            <wp:docPr id="6" name="image2.png"/>
             <a:graphic>
               <a:graphicData uri="http://schemas.openxmlformats.org/drawingml/2006/picture">
                 <pic:pic>
                   <pic:nvPicPr>
-                    <pic:cNvPr id="0" name="image16.png"/>
+                    <pic:cNvPr id="0" name="image2.png"/>
                     <pic:cNvPicPr preferRelativeResize="0"/>
                   </pic:nvPicPr>
                   <pic:blipFill>
@@ -4847,12 +4908,12 @@
           <wp:inline distB="19050" distT="19050" distL="19050" distR="19050">
             <wp:extent cx="929481" cy="229187"/>
             <wp:effectExtent b="0" l="0" r="0" t="0"/>
-            <wp:docPr id="7" name="image7.png"/>
+            <wp:docPr id="7" name="image18.png"/>
             <a:graphic>
               <a:graphicData uri="http://schemas.openxmlformats.org/drawingml/2006/picture">
                 <pic:pic>
                   <pic:nvPicPr>
-                    <pic:cNvPr id="0" name="image7.png"/>
+                    <pic:cNvPr id="0" name="image18.png"/>
                     <pic:cNvPicPr preferRelativeResize="0"/>
                   </pic:nvPicPr>
                   <pic:blipFill>
@@ -4914,6 +4975,11 @@
         </w:rPr>
         <w:t xml:space="preserve">13</w:t>
       </w:r>
+      <w:r>
+        <w:rPr>
+          <w:rtl w:val="0"/>
+        </w:rPr>
+      </w:r>
     </w:p>
     <w:p>
       <w:pPr>
@@ -5001,6 +5067,7 @@
         <w:shd w:fill="auto" w:val="clear"/>
         <w:spacing w:line="275.9999942779541" w:lineRule="auto"/>
         <w:ind w:left="590.3999984264374" w:hanging="360"/>
+        <w:rPr/>
       </w:pPr>
       <w:r>
         <w:rPr>
@@ -5023,12 +5090,12 @@
           <wp:inline distB="19050" distT="19050" distL="19050" distR="19050">
             <wp:extent cx="302816" cy="239729"/>
             <wp:effectExtent b="0" l="0" r="0" t="0"/>
-            <wp:docPr id="8" name="image8.png"/>
+            <wp:docPr id="8" name="image10.png"/>
             <a:graphic>
               <a:graphicData uri="http://schemas.openxmlformats.org/drawingml/2006/picture">
                 <pic:pic>
                   <pic:nvPicPr>
-                    <pic:cNvPr id="0" name="image8.png"/>
+                    <pic:cNvPr id="0" name="image10.png"/>
                     <pic:cNvPicPr preferRelativeResize="0"/>
                   </pic:nvPicPr>
                   <pic:blipFill>
@@ -5079,12 +5146,12 @@
           <wp:inline distB="19050" distT="19050" distL="19050" distR="19050">
             <wp:extent cx="358775" cy="230641"/>
             <wp:effectExtent b="0" l="0" r="0" t="0"/>
-            <wp:docPr id="9" name="image15.png"/>
+            <wp:docPr id="9" name="image3.png"/>
             <a:graphic>
               <a:graphicData uri="http://schemas.openxmlformats.org/drawingml/2006/picture">
                 <pic:pic>
                   <pic:nvPicPr>
-                    <pic:cNvPr id="0" name="image15.png"/>
+                    <pic:cNvPr id="0" name="image3.png"/>
                     <pic:cNvPicPr preferRelativeResize="0"/>
                   </pic:nvPicPr>
                   <pic:blipFill>
@@ -5125,12 +5192,12 @@
           <wp:inline distB="19050" distT="19050" distL="19050" distR="19050">
             <wp:extent cx="456605" cy="228302"/>
             <wp:effectExtent b="0" l="0" r="0" t="0"/>
-            <wp:docPr id="10" name="image19.png"/>
+            <wp:docPr id="10" name="image11.png"/>
             <a:graphic>
               <a:graphicData uri="http://schemas.openxmlformats.org/drawingml/2006/picture">
                 <pic:pic>
                   <pic:nvPicPr>
-                    <pic:cNvPr id="0" name="image19.png"/>
+                    <pic:cNvPr id="0" name="image11.png"/>
                     <pic:cNvPicPr preferRelativeResize="0"/>
                   </pic:nvPicPr>
                   <pic:blipFill>
@@ -5212,12 +5279,12 @@
           <wp:inline distB="19050" distT="19050" distL="19050" distR="19050">
             <wp:extent cx="5905500" cy="690140"/>
             <wp:effectExtent b="0" l="0" r="0" t="0"/>
-            <wp:docPr id="38" name="image35.png"/>
+            <wp:docPr id="38" name="image41.png"/>
             <a:graphic>
               <a:graphicData uri="http://schemas.openxmlformats.org/drawingml/2006/picture">
                 <pic:pic>
                   <pic:nvPicPr>
-                    <pic:cNvPr id="0" name="image35.png"/>
+                    <pic:cNvPr id="0" name="image41.png"/>
                     <pic:cNvPicPr preferRelativeResize="0"/>
                   </pic:nvPicPr>
                   <pic:blipFill>
@@ -5277,12 +5344,12 @@
           <wp:inline distB="19050" distT="19050" distL="19050" distR="19050">
             <wp:extent cx="534193" cy="241659"/>
             <wp:effectExtent b="0" l="0" r="0" t="0"/>
-            <wp:docPr id="39" name="image34.png"/>
+            <wp:docPr id="39" name="image28.png"/>
             <a:graphic>
               <a:graphicData uri="http://schemas.openxmlformats.org/drawingml/2006/picture">
                 <pic:pic>
                   <pic:nvPicPr>
-                    <pic:cNvPr id="0" name="image34.png"/>
+                    <pic:cNvPr id="0" name="image28.png"/>
                     <pic:cNvPicPr preferRelativeResize="0"/>
                   </pic:nvPicPr>
                   <pic:blipFill>
@@ -5323,12 +5390,12 @@
           <wp:inline distB="19050" distT="19050" distL="19050" distR="19050">
             <wp:extent cx="97829" cy="251561"/>
             <wp:effectExtent b="0" l="0" r="0" t="0"/>
-            <wp:docPr id="40" name="image39.png"/>
+            <wp:docPr id="40" name="image30.png"/>
             <a:graphic>
               <a:graphicData uri="http://schemas.openxmlformats.org/drawingml/2006/picture">
                 <pic:pic>
                   <pic:nvPicPr>
-                    <pic:cNvPr id="0" name="image39.png"/>
+                    <pic:cNvPr id="0" name="image30.png"/>
                     <pic:cNvPicPr preferRelativeResize="0"/>
                   </pic:nvPicPr>
                   <pic:blipFill>
@@ -5369,12 +5436,12 @@
           <wp:inline distB="19050" distT="19050" distL="19050" distR="19050">
             <wp:extent cx="653058" cy="243296"/>
             <wp:effectExtent b="0" l="0" r="0" t="0"/>
-            <wp:docPr id="41" name="image32.png"/>
+            <wp:docPr id="41" name="image24.png"/>
             <a:graphic>
               <a:graphicData uri="http://schemas.openxmlformats.org/drawingml/2006/picture">
                 <pic:pic>
                   <pic:nvPicPr>
-                    <pic:cNvPr id="0" name="image32.png"/>
+                    <pic:cNvPr id="0" name="image24.png"/>
                     <pic:cNvPicPr preferRelativeResize="0"/>
                   </pic:nvPicPr>
                   <pic:blipFill>
@@ -5415,12 +5482,12 @@
           <wp:inline distB="19050" distT="19050" distL="19050" distR="19050">
             <wp:extent cx="97829" cy="251561"/>
             <wp:effectExtent b="0" l="0" r="0" t="0"/>
-            <wp:docPr id="42" name="image39.png"/>
+            <wp:docPr id="42" name="image30.png"/>
             <a:graphic>
               <a:graphicData uri="http://schemas.openxmlformats.org/drawingml/2006/picture">
                 <pic:pic>
                   <pic:nvPicPr>
-                    <pic:cNvPr id="0" name="image39.png"/>
+                    <pic:cNvPr id="0" name="image30.png"/>
                     <pic:cNvPicPr preferRelativeResize="0"/>
                   </pic:nvPicPr>
                   <pic:blipFill>
@@ -5463,6 +5530,11 @@
         </w:rPr>
         <w:t xml:space="preserve">20</w:t>
       </w:r>
+      <w:r>
+        <w:rPr>
+          <w:rtl w:val="0"/>
+        </w:rPr>
+      </w:r>
     </w:p>
     <w:p>
       <w:pPr>
@@ -5480,6 +5552,7 @@
         <w:shd w:fill="auto" w:val="clear"/>
         <w:spacing w:line="275.9999942779541" w:lineRule="auto"/>
         <w:ind w:left="590.3999984264374" w:hanging="360"/>
+        <w:rPr/>
       </w:pPr>
       <w:r>
         <w:rPr>
@@ -5502,12 +5575,12 @@
           <wp:inline distB="19050" distT="19050" distL="19050" distR="19050">
             <wp:extent cx="359569" cy="243993"/>
             <wp:effectExtent b="0" l="0" r="0" t="0"/>
-            <wp:docPr id="43" name="image36.png"/>
+            <wp:docPr id="43" name="image37.png"/>
             <a:graphic>
               <a:graphicData uri="http://schemas.openxmlformats.org/drawingml/2006/picture">
                 <pic:pic>
                   <pic:nvPicPr>
-                    <pic:cNvPr id="0" name="image36.png"/>
+                    <pic:cNvPr id="0" name="image37.png"/>
                     <pic:cNvPicPr preferRelativeResize="0"/>
                   </pic:nvPicPr>
                   <pic:blipFill>
@@ -5558,12 +5631,12 @@
           <wp:inline distB="19050" distT="19050" distL="19050" distR="19050">
             <wp:extent cx="510976" cy="229939"/>
             <wp:effectExtent b="0" l="0" r="0" t="0"/>
-            <wp:docPr id="44" name="image40.png"/>
+            <wp:docPr id="44" name="image33.png"/>
             <a:graphic>
               <a:graphicData uri="http://schemas.openxmlformats.org/drawingml/2006/picture">
                 <pic:pic>
                   <pic:nvPicPr>
-                    <pic:cNvPr id="0" name="image40.png"/>
+                    <pic:cNvPr id="0" name="image33.png"/>
                     <pic:cNvPicPr preferRelativeResize="0"/>
                   </pic:nvPicPr>
                   <pic:blipFill>
@@ -5653,12 +5726,12 @@
           <wp:inline distB="19050" distT="19050" distL="19050" distR="19050">
             <wp:extent cx="5905500" cy="690140"/>
             <wp:effectExtent b="0" l="0" r="0" t="0"/>
-            <wp:docPr id="45" name="image37.png"/>
+            <wp:docPr id="45" name="image42.png"/>
             <a:graphic>
               <a:graphicData uri="http://schemas.openxmlformats.org/drawingml/2006/picture">
                 <pic:pic>
                   <pic:nvPicPr>
-                    <pic:cNvPr id="0" name="image37.png"/>
+                    <pic:cNvPr id="0" name="image42.png"/>
                     <pic:cNvPicPr preferRelativeResize="0"/>
                   </pic:nvPicPr>
                   <pic:blipFill>
@@ -5704,6 +5777,7 @@
         <w:shd w:fill="auto" w:val="clear"/>
         <w:spacing w:line="275.9999942779541" w:lineRule="auto"/>
         <w:ind w:left="590.3999984264374" w:hanging="360"/>
+        <w:rPr/>
       </w:pPr>
       <w:r>
         <w:rPr>
@@ -5726,12 +5800,12 @@
           <wp:inline distB="19050" distT="19050" distL="19050" distR="19050">
             <wp:extent cx="278606" cy="252072"/>
             <wp:effectExtent b="0" l="0" r="0" t="0"/>
-            <wp:docPr id="46" name="image42.png"/>
+            <wp:docPr id="46" name="image40.png"/>
             <a:graphic>
               <a:graphicData uri="http://schemas.openxmlformats.org/drawingml/2006/picture">
                 <pic:pic>
                   <pic:nvPicPr>
-                    <pic:cNvPr id="0" name="image42.png"/>
+                    <pic:cNvPr id="0" name="image40.png"/>
                     <pic:cNvPicPr preferRelativeResize="0"/>
                   </pic:nvPicPr>
                   <pic:blipFill>
@@ -5801,12 +5875,12 @@
           <wp:inline distB="19050" distT="19050" distL="19050" distR="19050">
             <wp:extent cx="898525" cy="243885"/>
             <wp:effectExtent b="0" l="0" r="0" t="0"/>
-            <wp:docPr id="47" name="image38.png"/>
+            <wp:docPr id="47" name="image46.png"/>
             <a:graphic>
               <a:graphicData uri="http://schemas.openxmlformats.org/drawingml/2006/picture">
                 <pic:pic>
                   <pic:nvPicPr>
-                    <pic:cNvPr id="0" name="image38.png"/>
+                    <pic:cNvPr id="0" name="image46.png"/>
                     <pic:cNvPicPr preferRelativeResize="0"/>
                   </pic:nvPicPr>
                   <pic:blipFill>
@@ -5896,12 +5970,12 @@
           <wp:inline distB="19050" distT="19050" distL="19050" distR="19050">
             <wp:extent cx="5905500" cy="690140"/>
             <wp:effectExtent b="0" l="0" r="0" t="0"/>
-            <wp:docPr id="37" name="image30.png"/>
+            <wp:docPr id="37" name="image38.png"/>
             <a:graphic>
               <a:graphicData uri="http://schemas.openxmlformats.org/drawingml/2006/picture">
                 <pic:pic>
                   <pic:nvPicPr>
-                    <pic:cNvPr id="0" name="image30.png"/>
+                    <pic:cNvPr id="0" name="image38.png"/>
                     <pic:cNvPicPr preferRelativeResize="0"/>
                   </pic:nvPicPr>
                   <pic:blipFill>
@@ -9128,6 +9202,7 @@
         <w:shd w:fill="auto" w:val="clear"/>
         <w:spacing w:line="275.9999942779541" w:lineRule="auto"/>
         <w:ind w:left="600" w:hanging="360"/>
+        <w:rPr/>
       </w:pPr>
       <w:r>
         <w:rPr>
@@ -9176,6 +9251,11 @@
           <w:rtl w:val="0"/>
         </w:rPr>
         <w:t xml:space="preserve">2</w:t>
+      </w:r>
+      <w:r>
+        <w:rPr>
+          <w:rtl w:val="0"/>
+        </w:rPr>
       </w:r>
     </w:p>
     <w:p>
@@ -9194,6 +9274,7 @@
         <w:shd w:fill="auto" w:val="clear"/>
         <w:spacing w:line="275.9999942779541" w:lineRule="auto"/>
         <w:ind w:left="600" w:hanging="360"/>
+        <w:rPr/>
       </w:pPr>
       <w:r>
         <w:rPr>
@@ -9242,6 +9323,11 @@
           <w:rtl w:val="0"/>
         </w:rPr>
         <w:t xml:space="preserve">2</w:t>
+      </w:r>
+      <w:r>
+        <w:rPr>
+          <w:rtl w:val="0"/>
+        </w:rPr>
       </w:r>
     </w:p>
     <w:p>
@@ -9260,6 +9346,7 @@
         <w:shd w:fill="auto" w:val="clear"/>
         <w:spacing w:line="275.9999942779541" w:lineRule="auto"/>
         <w:ind w:left="600" w:hanging="360"/>
+        <w:rPr/>
       </w:pPr>
       <w:r>
         <w:rPr>
@@ -9308,6 +9395,11 @@
           <w:rtl w:val="0"/>
         </w:rPr>
         <w:t xml:space="preserve">2</w:t>
+      </w:r>
+      <w:r>
+        <w:rPr>
+          <w:rtl w:val="0"/>
+        </w:rPr>
       </w:r>
     </w:p>
     <w:p>
@@ -9326,6 +9418,7 @@
         <w:shd w:fill="auto" w:val="clear"/>
         <w:spacing w:line="275.9999942779541" w:lineRule="auto"/>
         <w:ind w:left="600" w:hanging="360"/>
+        <w:rPr/>
       </w:pPr>
       <w:r>
         <w:rPr>
@@ -9374,6 +9467,11 @@
           <w:rtl w:val="0"/>
         </w:rPr>
         <w:t xml:space="preserve">2</w:t>
+      </w:r>
+      <w:r>
+        <w:rPr>
+          <w:rtl w:val="0"/>
+        </w:rPr>
       </w:r>
     </w:p>
     <w:p>
@@ -9392,6 +9490,7 @@
         <w:shd w:fill="auto" w:val="clear"/>
         <w:spacing w:line="275.9999942779541" w:lineRule="auto"/>
         <w:ind w:left="600" w:hanging="360"/>
+        <w:rPr/>
       </w:pPr>
       <w:r>
         <w:rPr>
@@ -9440,6 +9539,11 @@
           <w:rtl w:val="0"/>
         </w:rPr>
         <w:t xml:space="preserve">2</w:t>
+      </w:r>
+      <w:r>
+        <w:rPr>
+          <w:rtl w:val="0"/>
+        </w:rPr>
       </w:r>
     </w:p>
     <w:p>
@@ -9642,12 +9746,12 @@
           <wp:inline distB="19050" distT="19050" distL="19050" distR="19050">
             <wp:extent cx="1337472" cy="229281"/>
             <wp:effectExtent b="0" l="0" r="0" t="0"/>
-            <wp:docPr id="28" name="image9.png"/>
+            <wp:docPr id="28" name="image7.png"/>
             <a:graphic>
               <a:graphicData uri="http://schemas.openxmlformats.org/drawingml/2006/picture">
                 <pic:pic>
                   <pic:nvPicPr>
-                    <pic:cNvPr id="0" name="image9.png"/>
+                    <pic:cNvPr id="0" name="image7.png"/>
                     <pic:cNvPicPr preferRelativeResize="0"/>
                   </pic:nvPicPr>
                   <pic:blipFill>
@@ -10106,7 +10210,6 @@
             <w:pPr>
               <w:keepNext w:val="0"/>
               <w:keepLines w:val="0"/>
-              <w:pageBreakBefore w:val="0"/>
               <w:widowControl w:val="0"/>
               <w:pBdr>
                 <w:top w:space="0" w:sz="0" w:val="nil"/>
@@ -10139,12 +10242,12 @@
                 <wp:inline distB="19050" distT="19050" distL="19050" distR="19050">
                   <wp:extent cx="653058" cy="204881"/>
                   <wp:effectExtent b="0" l="0" r="0" t="0"/>
-                  <wp:docPr id="29" name="image29.png"/>
+                  <wp:docPr id="29" name="image22.png"/>
                   <a:graphic>
                     <a:graphicData uri="http://schemas.openxmlformats.org/drawingml/2006/picture">
                       <pic:pic>
                         <pic:nvPicPr>
-                          <pic:cNvPr id="0" name="image29.png"/>
+                          <pic:cNvPr id="0" name="image22.png"/>
                           <pic:cNvPicPr preferRelativeResize="0"/>
                         </pic:nvPicPr>
                         <pic:blipFill>
@@ -10387,7 +10490,6 @@
             <w:pPr>
               <w:keepNext w:val="0"/>
               <w:keepLines w:val="0"/>
-              <w:pageBreakBefore w:val="0"/>
               <w:widowControl w:val="0"/>
               <w:pBdr>
                 <w:top w:space="0" w:sz="0" w:val="nil"/>
@@ -10420,12 +10522,12 @@
                 <wp:inline distB="19050" distT="19050" distL="19050" distR="19050">
                   <wp:extent cx="653058" cy="204881"/>
                   <wp:effectExtent b="0" l="0" r="0" t="0"/>
-                  <wp:docPr id="30" name="image25.png"/>
+                  <wp:docPr id="30" name="image17.png"/>
                   <a:graphic>
                     <a:graphicData uri="http://schemas.openxmlformats.org/drawingml/2006/picture">
                       <pic:pic>
                         <pic:nvPicPr>
-                          <pic:cNvPr id="0" name="image25.png"/>
+                          <pic:cNvPr id="0" name="image17.png"/>
                           <pic:cNvPicPr preferRelativeResize="0"/>
                         </pic:nvPicPr>
                         <pic:blipFill>
@@ -10688,7 +10790,6 @@
             <w:pPr>
               <w:keepNext w:val="0"/>
               <w:keepLines w:val="0"/>
-              <w:pageBreakBefore w:val="0"/>
               <w:widowControl w:val="0"/>
               <w:pBdr>
                 <w:top w:space="0" w:sz="0" w:val="nil"/>
@@ -10721,12 +10822,12 @@
                 <wp:inline distB="19050" distT="19050" distL="19050" distR="19050">
                   <wp:extent cx="653058" cy="204881"/>
                   <wp:effectExtent b="0" l="0" r="0" t="0"/>
-                  <wp:docPr id="31" name="image31.png"/>
+                  <wp:docPr id="31" name="image21.png"/>
                   <a:graphic>
                     <a:graphicData uri="http://schemas.openxmlformats.org/drawingml/2006/picture">
                       <pic:pic>
                         <pic:nvPicPr>
-                          <pic:cNvPr id="0" name="image31.png"/>
+                          <pic:cNvPr id="0" name="image21.png"/>
                           <pic:cNvPicPr preferRelativeResize="0"/>
                         </pic:nvPicPr>
                         <pic:blipFill>
@@ -10969,7 +11070,6 @@
             <w:pPr>
               <w:keepNext w:val="0"/>
               <w:keepLines w:val="0"/>
-              <w:pageBreakBefore w:val="0"/>
               <w:widowControl w:val="0"/>
               <w:pBdr>
                 <w:top w:space="0" w:sz="0" w:val="nil"/>
@@ -11002,12 +11102,12 @@
                 <wp:inline distB="19050" distT="19050" distL="19050" distR="19050">
                   <wp:extent cx="787598" cy="203251"/>
                   <wp:effectExtent b="0" l="0" r="0" t="0"/>
-                  <wp:docPr id="32" name="image24.png"/>
+                  <wp:docPr id="32" name="image39.png"/>
                   <a:graphic>
                     <a:graphicData uri="http://schemas.openxmlformats.org/drawingml/2006/picture">
                       <pic:pic>
                         <pic:nvPicPr>
-                          <pic:cNvPr id="0" name="image24.png"/>
+                          <pic:cNvPr id="0" name="image39.png"/>
                           <pic:cNvPicPr preferRelativeResize="0"/>
                         </pic:nvPicPr>
                         <pic:blipFill>
@@ -11093,12 +11193,12 @@
                 <wp:inline distB="19050" distT="19050" distL="19050" distR="19050">
                   <wp:extent cx="485973" cy="230198"/>
                   <wp:effectExtent b="0" l="0" r="0" t="0"/>
-                  <wp:docPr id="33" name="image5.png"/>
+                  <wp:docPr id="33" name="image6.png"/>
                   <a:graphic>
                     <a:graphicData uri="http://schemas.openxmlformats.org/drawingml/2006/picture">
                       <pic:pic>
                         <pic:nvPicPr>
-                          <pic:cNvPr id="0" name="image5.png"/>
+                          <pic:cNvPr id="0" name="image6.png"/>
                           <pic:cNvPicPr preferRelativeResize="0"/>
                         </pic:nvPicPr>
                         <pic:blipFill>
@@ -11141,12 +11241,12 @@
                 <wp:inline distB="19050" distT="19050" distL="19050" distR="19050">
                   <wp:extent cx="494507" cy="228234"/>
                   <wp:effectExtent b="0" l="0" r="0" t="0"/>
-                  <wp:docPr id="34" name="image27.png"/>
+                  <wp:docPr id="34" name="image34.png"/>
                   <a:graphic>
                     <a:graphicData uri="http://schemas.openxmlformats.org/drawingml/2006/picture">
                       <pic:pic>
                         <pic:nvPicPr>
-                          <pic:cNvPr id="0" name="image27.png"/>
+                          <pic:cNvPr id="0" name="image34.png"/>
                           <pic:cNvPicPr preferRelativeResize="0"/>
                         </pic:nvPicPr>
                         <pic:blipFill>
@@ -11346,7 +11446,6 @@
             <w:pPr>
               <w:keepNext w:val="0"/>
               <w:keepLines w:val="0"/>
-              <w:pageBreakBefore w:val="0"/>
               <w:widowControl w:val="0"/>
               <w:pBdr>
                 <w:top w:space="0" w:sz="0" w:val="nil"/>
@@ -11379,12 +11478,12 @@
                 <wp:inline distB="19050" distT="19050" distL="19050" distR="19050">
                   <wp:extent cx="653058" cy="204881"/>
                   <wp:effectExtent b="0" l="0" r="0" t="0"/>
-                  <wp:docPr id="35" name="image33.png"/>
+                  <wp:docPr id="35" name="image25.png"/>
                   <a:graphic>
                     <a:graphicData uri="http://schemas.openxmlformats.org/drawingml/2006/picture">
                       <pic:pic>
                         <pic:nvPicPr>
-                          <pic:cNvPr id="0" name="image33.png"/>
+                          <pic:cNvPr id="0" name="image25.png"/>
                           <pic:cNvPicPr preferRelativeResize="0"/>
                         </pic:nvPicPr>
                         <pic:blipFill>
@@ -11627,7 +11726,6 @@
             <w:pPr>
               <w:keepNext w:val="0"/>
               <w:keepLines w:val="0"/>
-              <w:pageBreakBefore w:val="0"/>
               <w:widowControl w:val="0"/>
               <w:pBdr>
                 <w:top w:space="0" w:sz="0" w:val="nil"/>
@@ -11660,12 +11758,12 @@
                 <wp:inline distB="19050" distT="19050" distL="19050" distR="19050">
                   <wp:extent cx="653058" cy="204881"/>
                   <wp:effectExtent b="0" l="0" r="0" t="0"/>
-                  <wp:docPr id="36" name="image28.png"/>
+                  <wp:docPr id="36" name="image23.png"/>
                   <a:graphic>
                     <a:graphicData uri="http://schemas.openxmlformats.org/drawingml/2006/picture">
                       <pic:pic>
                         <pic:nvPicPr>
-                          <pic:cNvPr id="0" name="image28.png"/>
+                          <pic:cNvPr id="0" name="image23.png"/>
                           <pic:cNvPicPr preferRelativeResize="0"/>
                         </pic:nvPicPr>
                         <pic:blipFill>
@@ -11751,12 +11849,12 @@
                 <wp:inline distB="19050" distT="19050" distL="19050" distR="19050">
                   <wp:extent cx="653058" cy="204881"/>
                   <wp:effectExtent b="0" l="0" r="0" t="0"/>
-                  <wp:docPr id="26" name="image25.png"/>
+                  <wp:docPr id="26" name="image17.png"/>
                   <a:graphic>
                     <a:graphicData uri="http://schemas.openxmlformats.org/drawingml/2006/picture">
                       <pic:pic>
                         <pic:nvPicPr>
-                          <pic:cNvPr id="0" name="image25.png"/>
+                          <pic:cNvPr id="0" name="image17.png"/>
                           <pic:cNvPicPr preferRelativeResize="0"/>
                         </pic:nvPicPr>
                         <pic:blipFill>
@@ -11799,12 +11897,12 @@
                 <wp:inline distB="19050" distT="19050" distL="19050" distR="19050">
                   <wp:extent cx="653058" cy="204881"/>
                   <wp:effectExtent b="0" l="0" r="0" t="0"/>
-                  <wp:docPr id="27" name="image33.png"/>
+                  <wp:docPr id="27" name="image25.png"/>
                   <a:graphic>
                     <a:graphicData uri="http://schemas.openxmlformats.org/drawingml/2006/picture">
                       <pic:pic>
                         <pic:nvPicPr>
-                          <pic:cNvPr id="0" name="image33.png"/>
+                          <pic:cNvPr id="0" name="image25.png"/>
                           <pic:cNvPicPr preferRelativeResize="0"/>
                         </pic:nvPicPr>
                         <pic:blipFill>
@@ -12004,7 +12102,6 @@
             <w:pPr>
               <w:keepNext w:val="0"/>
               <w:keepLines w:val="0"/>
-              <w:pageBreakBefore w:val="0"/>
               <w:widowControl w:val="0"/>
               <w:pBdr>
                 <w:top w:space="0" w:sz="0" w:val="nil"/>
@@ -12037,12 +12134,12 @@
                 <wp:inline distB="19050" distT="19050" distL="19050" distR="19050">
                   <wp:extent cx="787598" cy="203251"/>
                   <wp:effectExtent b="0" l="0" r="0" t="0"/>
-                  <wp:docPr id="62" name="image56.png"/>
+                  <wp:docPr id="62" name="image55.png"/>
                   <a:graphic>
                     <a:graphicData uri="http://schemas.openxmlformats.org/drawingml/2006/picture">
                       <pic:pic>
                         <pic:nvPicPr>
-                          <pic:cNvPr id="0" name="image56.png"/>
+                          <pic:cNvPr id="0" name="image55.png"/>
                           <pic:cNvPicPr preferRelativeResize="0"/>
                         </pic:nvPicPr>
                         <pic:blipFill>
@@ -12128,12 +12225,12 @@
                 <wp:inline distB="19050" distT="19050" distL="19050" distR="19050">
                   <wp:extent cx="787598" cy="203251"/>
                   <wp:effectExtent b="0" l="0" r="0" t="0"/>
-                  <wp:docPr id="63" name="image54.png"/>
+                  <wp:docPr id="63" name="image51.png"/>
                   <a:graphic>
                     <a:graphicData uri="http://schemas.openxmlformats.org/drawingml/2006/picture">
                       <pic:pic>
                         <pic:nvPicPr>
-                          <pic:cNvPr id="0" name="image54.png"/>
+                          <pic:cNvPr id="0" name="image51.png"/>
                           <pic:cNvPicPr preferRelativeResize="0"/>
                         </pic:nvPicPr>
                         <pic:blipFill>
@@ -12333,7 +12430,6 @@
             <w:pPr>
               <w:keepNext w:val="0"/>
               <w:keepLines w:val="0"/>
-              <w:pageBreakBefore w:val="0"/>
               <w:widowControl w:val="0"/>
               <w:pBdr>
                 <w:top w:space="0" w:sz="0" w:val="nil"/>
@@ -12366,12 +12462,12 @@
                 <wp:inline distB="19050" distT="19050" distL="19050" distR="19050">
                   <wp:extent cx="787598" cy="203251"/>
                   <wp:effectExtent b="0" l="0" r="0" t="0"/>
-                  <wp:docPr id="64" name="image74.png"/>
+                  <wp:docPr id="64" name="image48.png"/>
                   <a:graphic>
                     <a:graphicData uri="http://schemas.openxmlformats.org/drawingml/2006/picture">
                       <pic:pic>
                         <pic:nvPicPr>
-                          <pic:cNvPr id="0" name="image74.png"/>
+                          <pic:cNvPr id="0" name="image48.png"/>
                           <pic:cNvPicPr preferRelativeResize="0"/>
                         </pic:nvPicPr>
                         <pic:blipFill>
@@ -12525,12 +12621,12 @@
                 <wp:inline distB="19050" distT="19050" distL="19050" distR="19050">
                   <wp:extent cx="230584" cy="204964"/>
                   <wp:effectExtent b="0" l="0" r="0" t="0"/>
-                  <wp:docPr id="65" name="image57.png"/>
+                  <wp:docPr id="65" name="image69.png"/>
                   <a:graphic>
                     <a:graphicData uri="http://schemas.openxmlformats.org/drawingml/2006/picture">
                       <pic:pic>
                         <pic:nvPicPr>
-                          <pic:cNvPr id="0" name="image57.png"/>
+                          <pic:cNvPr id="0" name="image69.png"/>
                           <pic:cNvPicPr preferRelativeResize="0"/>
                         </pic:nvPicPr>
                         <pic:blipFill>
@@ -12666,7 +12762,6 @@
             <w:pPr>
               <w:keepNext w:val="0"/>
               <w:keepLines w:val="0"/>
-              <w:pageBreakBefore w:val="0"/>
               <w:widowControl w:val="0"/>
               <w:pBdr>
                 <w:top w:space="0" w:sz="0" w:val="nil"/>
@@ -12699,12 +12794,12 @@
                 <wp:inline distB="19050" distT="19050" distL="19050" distR="19050">
                   <wp:extent cx="653058" cy="204881"/>
                   <wp:effectExtent b="0" l="0" r="0" t="0"/>
-                  <wp:docPr id="66" name="image61.png"/>
+                  <wp:docPr id="66" name="image50.png"/>
                   <a:graphic>
                     <a:graphicData uri="http://schemas.openxmlformats.org/drawingml/2006/picture">
                       <pic:pic>
                         <pic:nvPicPr>
-                          <pic:cNvPr id="0" name="image61.png"/>
+                          <pic:cNvPr id="0" name="image50.png"/>
                           <pic:cNvPicPr preferRelativeResize="0"/>
                         </pic:nvPicPr>
                         <pic:blipFill>
@@ -12790,12 +12885,12 @@
                 <wp:inline distB="19050" distT="19050" distL="19050" distR="19050">
                   <wp:extent cx="230584" cy="204964"/>
                   <wp:effectExtent b="0" l="0" r="0" t="0"/>
-                  <wp:docPr id="67" name="image57.png"/>
+                  <wp:docPr id="67" name="image69.png"/>
                   <a:graphic>
                     <a:graphicData uri="http://schemas.openxmlformats.org/drawingml/2006/picture">
                       <pic:pic>
                         <pic:nvPicPr>
-                          <pic:cNvPr id="0" name="image57.png"/>
+                          <pic:cNvPr id="0" name="image69.png"/>
                           <pic:cNvPicPr preferRelativeResize="0"/>
                         </pic:nvPicPr>
                         <pic:blipFill>
@@ -12995,7 +13090,6 @@
             <w:pPr>
               <w:keepNext w:val="0"/>
               <w:keepLines w:val="0"/>
-              <w:pageBreakBefore w:val="0"/>
               <w:widowControl w:val="0"/>
               <w:pBdr>
                 <w:top w:space="0" w:sz="0" w:val="nil"/>
@@ -13028,12 +13122,12 @@
                 <wp:inline distB="19050" distT="19050" distL="19050" distR="19050">
                   <wp:extent cx="787598" cy="203251"/>
                   <wp:effectExtent b="0" l="0" r="0" t="0"/>
-                  <wp:docPr id="68" name="image60.png"/>
+                  <wp:docPr id="68" name="image66.png"/>
                   <a:graphic>
                     <a:graphicData uri="http://schemas.openxmlformats.org/drawingml/2006/picture">
                       <pic:pic>
                         <pic:nvPicPr>
-                          <pic:cNvPr id="0" name="image60.png"/>
+                          <pic:cNvPr id="0" name="image66.png"/>
                           <pic:cNvPicPr preferRelativeResize="0"/>
                         </pic:nvPicPr>
                         <pic:blipFill>
@@ -13187,12 +13281,12 @@
                 <wp:inline distB="19050" distT="19050" distL="19050" distR="19050">
                   <wp:extent cx="316904" cy="211270"/>
                   <wp:effectExtent b="0" l="0" r="0" t="0"/>
-                  <wp:docPr id="69" name="image53.png"/>
+                  <wp:docPr id="69" name="image43.png"/>
                   <a:graphic>
                     <a:graphicData uri="http://schemas.openxmlformats.org/drawingml/2006/picture">
                       <pic:pic>
                         <pic:nvPicPr>
-                          <pic:cNvPr id="0" name="image53.png"/>
+                          <pic:cNvPr id="0" name="image43.png"/>
                           <pic:cNvPicPr preferRelativeResize="0"/>
                         </pic:nvPicPr>
                         <pic:blipFill>
@@ -13328,7 +13422,6 @@
             <w:pPr>
               <w:keepNext w:val="0"/>
               <w:keepLines w:val="0"/>
-              <w:pageBreakBefore w:val="0"/>
               <w:widowControl w:val="0"/>
               <w:pBdr>
                 <w:top w:space="0" w:sz="0" w:val="nil"/>
@@ -13361,12 +13454,12 @@
                 <wp:inline distB="19050" distT="19050" distL="19050" distR="19050">
                   <wp:extent cx="653058" cy="204881"/>
                   <wp:effectExtent b="0" l="0" r="0" t="0"/>
-                  <wp:docPr id="59" name="image52.png"/>
+                  <wp:docPr id="59" name="image63.png"/>
                   <a:graphic>
                     <a:graphicData uri="http://schemas.openxmlformats.org/drawingml/2006/picture">
                       <pic:pic>
                         <pic:nvPicPr>
-                          <pic:cNvPr id="0" name="image52.png"/>
+                          <pic:cNvPr id="0" name="image63.png"/>
                           <pic:cNvPicPr preferRelativeResize="0"/>
                         </pic:nvPicPr>
                         <pic:blipFill>
@@ -13609,7 +13702,6 @@
             <w:pPr>
               <w:keepNext w:val="0"/>
               <w:keepLines w:val="0"/>
-              <w:pageBreakBefore w:val="0"/>
               <w:widowControl w:val="0"/>
               <w:pBdr>
                 <w:top w:space="0" w:sz="0" w:val="nil"/>
@@ -13642,12 +13734,12 @@
                 <wp:inline distB="19050" distT="19050" distL="19050" distR="19050">
                   <wp:extent cx="653058" cy="204881"/>
                   <wp:effectExtent b="0" l="0" r="0" t="0"/>
-                  <wp:docPr id="60" name="image51.png"/>
+                  <wp:docPr id="60" name="image54.png"/>
                   <a:graphic>
                     <a:graphicData uri="http://schemas.openxmlformats.org/drawingml/2006/picture">
                       <pic:pic>
                         <pic:nvPicPr>
-                          <pic:cNvPr id="0" name="image51.png"/>
+                          <pic:cNvPr id="0" name="image54.png"/>
                           <pic:cNvPicPr preferRelativeResize="0"/>
                         </pic:nvPicPr>
                         <pic:blipFill>
@@ -13733,12 +13825,12 @@
                 <wp:inline distB="19050" distT="19050" distL="19050" distR="19050">
                   <wp:extent cx="316904" cy="211270"/>
                   <wp:effectExtent b="0" l="0" r="0" t="0"/>
-                  <wp:docPr id="61" name="image53.png"/>
+                  <wp:docPr id="61" name="image43.png"/>
                   <a:graphic>
                     <a:graphicData uri="http://schemas.openxmlformats.org/drawingml/2006/picture">
                       <pic:pic>
                         <pic:nvPicPr>
-                          <pic:cNvPr id="0" name="image53.png"/>
+                          <pic:cNvPr id="0" name="image43.png"/>
                           <pic:cNvPicPr preferRelativeResize="0"/>
                         </pic:nvPicPr>
                         <pic:blipFill>
@@ -13938,7 +14030,6 @@
             <w:pPr>
               <w:keepNext w:val="0"/>
               <w:keepLines w:val="0"/>
-              <w:pageBreakBefore w:val="0"/>
               <w:widowControl w:val="0"/>
               <w:pBdr>
                 <w:top w:space="0" w:sz="0" w:val="nil"/>
@@ -13971,12 +14062,12 @@
                 <wp:inline distB="19050" distT="19050" distL="19050" distR="19050">
                   <wp:extent cx="787598" cy="203251"/>
                   <wp:effectExtent b="0" l="0" r="0" t="0"/>
-                  <wp:docPr id="52" name="image45.png"/>
+                  <wp:docPr id="52" name="image49.png"/>
                   <a:graphic>
                     <a:graphicData uri="http://schemas.openxmlformats.org/drawingml/2006/picture">
                       <pic:pic>
                         <pic:nvPicPr>
-                          <pic:cNvPr id="0" name="image45.png"/>
+                          <pic:cNvPr id="0" name="image49.png"/>
                           <pic:cNvPicPr preferRelativeResize="0"/>
                         </pic:nvPicPr>
                         <pic:blipFill>
@@ -14153,6 +14244,7 @@
         <w:shd w:fill="auto" w:val="clear"/>
         <w:spacing w:line="275.9999942779541" w:lineRule="auto"/>
         <w:ind w:left="590.3999984264374" w:hanging="360"/>
+        <w:rPr/>
       </w:pPr>
       <w:r>
         <w:rPr>
@@ -14181,12 +14273,12 @@
           <wp:inline distB="19050" distT="19050" distL="19050" distR="19050">
             <wp:extent cx="1337472" cy="229281"/>
             <wp:effectExtent b="0" l="0" r="0" t="0"/>
-            <wp:docPr id="53" name="image17.png"/>
+            <wp:docPr id="53" name="image13.png"/>
             <a:graphic>
               <a:graphicData uri="http://schemas.openxmlformats.org/drawingml/2006/picture">
                 <pic:pic>
                   <pic:nvPicPr>
-                    <pic:cNvPr id="0" name="image17.png"/>
+                    <pic:cNvPr id="0" name="image13.png"/>
                     <pic:cNvPicPr preferRelativeResize="0"/>
                   </pic:nvPicPr>
                   <pic:blipFill>
@@ -14248,6 +14340,11 @@
         </w:rPr>
         <w:t xml:space="preserve">2</w:t>
       </w:r>
+      <w:r>
+        <w:rPr>
+          <w:rtl w:val="0"/>
+        </w:rPr>
+      </w:r>
     </w:p>
     <w:p>
       <w:pPr>
@@ -14265,6 +14362,7 @@
         <w:shd w:fill="auto" w:val="clear"/>
         <w:spacing w:line="275.9999942779541" w:lineRule="auto"/>
         <w:ind w:left="590.3999984264374" w:hanging="360"/>
+        <w:rPr/>
       </w:pPr>
       <w:r>
         <w:rPr>
@@ -14293,12 +14391,12 @@
           <wp:inline distB="19050" distT="19050" distL="19050" distR="19050">
             <wp:extent cx="1185272" cy="229407"/>
             <wp:effectExtent b="0" l="0" r="0" t="0"/>
-            <wp:docPr id="54" name="image48.png"/>
+            <wp:docPr id="54" name="image52.png"/>
             <a:graphic>
               <a:graphicData uri="http://schemas.openxmlformats.org/drawingml/2006/picture">
                 <pic:pic>
                   <pic:nvPicPr>
-                    <pic:cNvPr id="0" name="image48.png"/>
+                    <pic:cNvPr id="0" name="image52.png"/>
                     <pic:cNvPicPr preferRelativeResize="0"/>
                   </pic:nvPicPr>
                   <pic:blipFill>
@@ -14360,6 +14458,11 @@
         </w:rPr>
         <w:t xml:space="preserve">2</w:t>
       </w:r>
+      <w:r>
+        <w:rPr>
+          <w:rtl w:val="0"/>
+        </w:rPr>
+      </w:r>
     </w:p>
     <w:p>
       <w:pPr>
@@ -14377,6 +14480,7 @@
         <w:shd w:fill="auto" w:val="clear"/>
         <w:spacing w:line="275.9999942779541" w:lineRule="auto"/>
         <w:ind w:left="590.3999984264374" w:hanging="360"/>
+        <w:rPr/>
       </w:pPr>
       <w:r>
         <w:rPr>
@@ -14405,12 +14509,12 @@
           <wp:inline distB="19050" distT="19050" distL="19050" distR="19050">
             <wp:extent cx="1185272" cy="229407"/>
             <wp:effectExtent b="0" l="0" r="0" t="0"/>
-            <wp:docPr id="55" name="image46.png"/>
+            <wp:docPr id="55" name="image56.png"/>
             <a:graphic>
               <a:graphicData uri="http://schemas.openxmlformats.org/drawingml/2006/picture">
                 <pic:pic>
                   <pic:nvPicPr>
-                    <pic:cNvPr id="0" name="image46.png"/>
+                    <pic:cNvPr id="0" name="image56.png"/>
                     <pic:cNvPicPr preferRelativeResize="0"/>
                   </pic:nvPicPr>
                   <pic:blipFill>
@@ -14490,6 +14594,11 @@
         </w:rPr>
         <w:t xml:space="preserve">2</w:t>
       </w:r>
+      <w:r>
+        <w:rPr>
+          <w:rtl w:val="0"/>
+        </w:rPr>
+      </w:r>
     </w:p>
     <w:p>
       <w:pPr>
@@ -14536,12 +14645,12 @@
           <wp:inline distB="19050" distT="19050" distL="19050" distR="19050">
             <wp:extent cx="281186" cy="242842"/>
             <wp:effectExtent b="0" l="0" r="0" t="0"/>
-            <wp:docPr id="56" name="image47.png"/>
+            <wp:docPr id="56" name="image58.png"/>
             <a:graphic>
               <a:graphicData uri="http://schemas.openxmlformats.org/drawingml/2006/picture">
                 <pic:pic>
                   <pic:nvPicPr>
-                    <pic:cNvPr id="0" name="image47.png"/>
+                    <pic:cNvPr id="0" name="image58.png"/>
                     <pic:cNvPicPr preferRelativeResize="0"/>
                   </pic:nvPicPr>
                   <pic:blipFill>
@@ -14647,12 +14756,12 @@
           <wp:inline distB="19050" distT="19050" distL="19050" distR="19050">
             <wp:extent cx="5905500" cy="753894"/>
             <wp:effectExtent b="0" l="0" r="0" t="0"/>
-            <wp:docPr id="57" name="image50.png"/>
+            <wp:docPr id="57" name="image45.png"/>
             <a:graphic>
               <a:graphicData uri="http://schemas.openxmlformats.org/drawingml/2006/picture">
                 <pic:pic>
                   <pic:nvPicPr>
-                    <pic:cNvPr id="0" name="image50.png"/>
+                    <pic:cNvPr id="0" name="image45.png"/>
                     <pic:cNvPicPr preferRelativeResize="0"/>
                   </pic:nvPicPr>
                   <pic:blipFill>
@@ -14751,12 +14860,12 @@
           <wp:inline distB="19050" distT="19050" distL="19050" distR="19050">
             <wp:extent cx="5905500" cy="661751"/>
             <wp:effectExtent b="0" l="0" r="0" t="0"/>
-            <wp:docPr id="58" name="image49.png"/>
+            <wp:docPr id="58" name="image47.png"/>
             <a:graphic>
               <a:graphicData uri="http://schemas.openxmlformats.org/drawingml/2006/picture">
                 <pic:pic>
                   <pic:nvPicPr>
-                    <pic:cNvPr id="0" name="image49.png"/>
+                    <pic:cNvPr id="0" name="image47.png"/>
                     <pic:cNvPicPr preferRelativeResize="0"/>
                   </pic:nvPicPr>
                   <pic:blipFill>
@@ -14871,12 +14980,12 @@
           <wp:inline distB="19050" distT="19050" distL="19050" distR="19050">
             <wp:extent cx="5905500" cy="628245"/>
             <wp:effectExtent b="0" l="0" r="0" t="0"/>
-            <wp:docPr id="49" name="image43.png"/>
+            <wp:docPr id="49" name="image32.png"/>
             <a:graphic>
               <a:graphicData uri="http://schemas.openxmlformats.org/drawingml/2006/picture">
                 <pic:pic>
                   <pic:nvPicPr>
-                    <pic:cNvPr id="0" name="image43.png"/>
+                    <pic:cNvPr id="0" name="image32.png"/>
                     <pic:cNvPicPr preferRelativeResize="0"/>
                   </pic:nvPicPr>
                   <pic:blipFill>
@@ -14942,12 +15051,12 @@
           <wp:inline distB="19050" distT="19050" distL="19050" distR="19050">
             <wp:extent cx="1185272" cy="229407"/>
             <wp:effectExtent b="0" l="0" r="0" t="0"/>
-            <wp:docPr id="50" name="image10.png"/>
+            <wp:docPr id="50" name="image8.png"/>
             <a:graphic>
               <a:graphicData uri="http://schemas.openxmlformats.org/drawingml/2006/picture">
                 <pic:pic>
                   <pic:nvPicPr>
-                    <pic:cNvPr id="0" name="image10.png"/>
+                    <pic:cNvPr id="0" name="image8.png"/>
                     <pic:cNvPicPr preferRelativeResize="0"/>
                   </pic:nvPicPr>
                   <pic:blipFill>
@@ -15007,12 +15116,12 @@
           <wp:inline distB="19050" distT="19050" distL="19050" distR="19050">
             <wp:extent cx="358775" cy="230641"/>
             <wp:effectExtent b="0" l="0" r="0" t="0"/>
-            <wp:docPr id="51" name="image13.png"/>
+            <wp:docPr id="51" name="image15.png"/>
             <a:graphic>
               <a:graphicData uri="http://schemas.openxmlformats.org/drawingml/2006/picture">
                 <pic:pic>
                   <pic:nvPicPr>
-                    <pic:cNvPr id="0" name="image13.png"/>
+                    <pic:cNvPr id="0" name="image15.png"/>
                     <pic:cNvPicPr preferRelativeResize="0"/>
                   </pic:nvPicPr>
                   <pic:blipFill>
@@ -15366,6 +15475,7 @@
         <w:shd w:fill="auto" w:val="clear"/>
         <w:spacing w:line="275.9999942779541" w:lineRule="auto"/>
         <w:ind w:left="600" w:hanging="360"/>
+        <w:rPr/>
       </w:pPr>
       <w:r>
         <w:rPr>
@@ -15414,6 +15524,11 @@
           <w:rtl w:val="0"/>
         </w:rPr>
         <w:t xml:space="preserve">4</w:t>
+      </w:r>
+      <w:r>
+        <w:rPr>
+          <w:rtl w:val="0"/>
+        </w:rPr>
       </w:r>
     </w:p>
     <w:p>
@@ -15432,6 +15547,7 @@
         <w:shd w:fill="auto" w:val="clear"/>
         <w:spacing w:line="275.9999942779541" w:lineRule="auto"/>
         <w:ind w:left="600" w:hanging="360"/>
+        <w:rPr/>
       </w:pPr>
       <w:r>
         <w:rPr>
@@ -15460,12 +15576,12 @@
           <wp:inline distB="19050" distT="19050" distL="19050" distR="19050">
             <wp:extent cx="485973" cy="230198"/>
             <wp:effectExtent b="0" l="0" r="0" t="0"/>
-            <wp:docPr id="86" name="image5.png"/>
+            <wp:docPr id="86" name="image6.png"/>
             <a:graphic>
               <a:graphicData uri="http://schemas.openxmlformats.org/drawingml/2006/picture">
                 <pic:pic>
                   <pic:nvPicPr>
-                    <pic:cNvPr id="0" name="image5.png"/>
+                    <pic:cNvPr id="0" name="image6.png"/>
                     <pic:cNvPicPr preferRelativeResize="0"/>
                   </pic:nvPicPr>
                   <pic:blipFill>
@@ -15525,12 +15641,12 @@
           <wp:inline distB="19050" distT="19050" distL="19050" distR="19050">
             <wp:extent cx="494507" cy="228234"/>
             <wp:effectExtent b="0" l="0" r="0" t="0"/>
-            <wp:docPr id="88" name="image27.png"/>
+            <wp:docPr id="88" name="image34.png"/>
             <a:graphic>
               <a:graphicData uri="http://schemas.openxmlformats.org/drawingml/2006/picture">
                 <pic:pic>
                   <pic:nvPicPr>
-                    <pic:cNvPr id="0" name="image27.png"/>
+                    <pic:cNvPr id="0" name="image34.png"/>
                     <pic:cNvPicPr preferRelativeResize="0"/>
                   </pic:nvPicPr>
                   <pic:blipFill>
@@ -15573,6 +15689,11 @@
         </w:rPr>
         <w:t xml:space="preserve">2</w:t>
       </w:r>
+      <w:r>
+        <w:rPr>
+          <w:rtl w:val="0"/>
+        </w:rPr>
+      </w:r>
     </w:p>
     <w:p>
       <w:pPr>
@@ -15590,6 +15711,7 @@
         <w:shd w:fill="auto" w:val="clear"/>
         <w:spacing w:line="275.9999942779541" w:lineRule="auto"/>
         <w:ind w:left="600" w:hanging="360"/>
+        <w:rPr/>
       </w:pPr>
       <w:r>
         <w:rPr>
@@ -15656,6 +15778,11 @@
           <w:rtl w:val="0"/>
         </w:rPr>
         <w:t xml:space="preserve">2</w:t>
+      </w:r>
+      <w:r>
+        <w:rPr>
+          <w:rtl w:val="0"/>
+        </w:rPr>
       </w:r>
     </w:p>
     <w:p>
@@ -15674,6 +15801,7 @@
         <w:shd w:fill="auto" w:val="clear"/>
         <w:spacing w:line="275.9999942779541" w:lineRule="auto"/>
         <w:ind w:left="600" w:hanging="360"/>
+        <w:rPr/>
       </w:pPr>
       <w:r>
         <w:rPr>
@@ -15730,6 +15858,11 @@
           <w:rtl w:val="0"/>
         </w:rPr>
         <w:t xml:space="preserve">:</w:t>
+      </w:r>
+      <w:r>
+        <w:rPr>
+          <w:rtl w:val="0"/>
+        </w:rPr>
       </w:r>
     </w:p>
     <w:p>
@@ -16609,6 +16742,7 @@
         <w:shd w:fill="auto" w:val="clear"/>
         <w:spacing w:line="275.9999942779541" w:lineRule="auto"/>
         <w:ind w:left="590.3999984264374" w:hanging="360"/>
+        <w:rPr/>
       </w:pPr>
       <w:r>
         <w:rPr>
@@ -16637,12 +16771,12 @@
           <wp:inline distB="19050" distT="19050" distL="19050" distR="19050">
             <wp:extent cx="195660" cy="234792"/>
             <wp:effectExtent b="0" l="0" r="0" t="0"/>
-            <wp:docPr id="90" name="image72.png"/>
+            <wp:docPr id="90" name="image77.png"/>
             <a:graphic>
               <a:graphicData uri="http://schemas.openxmlformats.org/drawingml/2006/picture">
                 <pic:pic>
                   <pic:nvPicPr>
-                    <pic:cNvPr id="0" name="image72.png"/>
+                    <pic:cNvPr id="0" name="image77.png"/>
                     <pic:cNvPicPr preferRelativeResize="0"/>
                   </pic:nvPicPr>
                   <pic:blipFill>
@@ -16683,12 +16817,12 @@
           <wp:inline distB="19050" distT="19050" distL="19050" distR="19050">
             <wp:extent cx="415330" cy="226544"/>
             <wp:effectExtent b="0" l="0" r="0" t="0"/>
-            <wp:docPr id="92" name="image80.png"/>
+            <wp:docPr id="92" name="image67.png"/>
             <a:graphic>
               <a:graphicData uri="http://schemas.openxmlformats.org/drawingml/2006/picture">
                 <pic:pic>
                   <pic:nvPicPr>
-                    <pic:cNvPr id="0" name="image80.png"/>
+                    <pic:cNvPr id="0" name="image67.png"/>
                     <pic:cNvPicPr preferRelativeResize="0"/>
                   </pic:nvPicPr>
                   <pic:blipFill>
@@ -16729,12 +16863,12 @@
           <wp:inline distB="19050" distT="19050" distL="19050" distR="19050">
             <wp:extent cx="195660" cy="234792"/>
             <wp:effectExtent b="0" l="0" r="0" t="0"/>
-            <wp:docPr id="94" name="image76.png"/>
+            <wp:docPr id="94" name="image80.png"/>
             <a:graphic>
               <a:graphicData uri="http://schemas.openxmlformats.org/drawingml/2006/picture">
                 <pic:pic>
                   <pic:nvPicPr>
-                    <pic:cNvPr id="0" name="image76.png"/>
+                    <pic:cNvPr id="0" name="image80.png"/>
                     <pic:cNvPicPr preferRelativeResize="0"/>
                   </pic:nvPicPr>
                   <pic:blipFill>
@@ -16775,12 +16909,12 @@
           <wp:inline distB="19050" distT="19050" distL="19050" distR="19050">
             <wp:extent cx="358775" cy="230641"/>
             <wp:effectExtent b="0" l="0" r="0" t="0"/>
-            <wp:docPr id="97" name="image81.png"/>
+            <wp:docPr id="97" name="image72.png"/>
             <a:graphic>
               <a:graphicData uri="http://schemas.openxmlformats.org/drawingml/2006/picture">
                 <pic:pic>
                   <pic:nvPicPr>
-                    <pic:cNvPr id="0" name="image81.png"/>
+                    <pic:cNvPr id="0" name="image72.png"/>
                     <pic:cNvPicPr preferRelativeResize="0"/>
                   </pic:nvPicPr>
                   <pic:blipFill>
@@ -16821,12 +16955,12 @@
           <wp:inline distB="19050" distT="19050" distL="19050" distR="19050">
             <wp:extent cx="485973" cy="230198"/>
             <wp:effectExtent b="0" l="0" r="0" t="0"/>
-            <wp:docPr id="13" name="image5.png"/>
+            <wp:docPr id="13" name="image6.png"/>
             <a:graphic>
               <a:graphicData uri="http://schemas.openxmlformats.org/drawingml/2006/picture">
                 <pic:pic>
                   <pic:nvPicPr>
-                    <pic:cNvPr id="0" name="image5.png"/>
+                    <pic:cNvPr id="0" name="image6.png"/>
                     <pic:cNvPicPr preferRelativeResize="0"/>
                   </pic:nvPicPr>
                   <pic:blipFill>
@@ -16888,6 +17022,11 @@
         </w:rPr>
         <w:t xml:space="preserve">2</w:t>
       </w:r>
+      <w:r>
+        <w:rPr>
+          <w:rtl w:val="0"/>
+        </w:rPr>
+      </w:r>
     </w:p>
     <w:p>
       <w:pPr>
@@ -16905,6 +17044,7 @@
         <w:shd w:fill="auto" w:val="clear"/>
         <w:spacing w:line="275.9999942779541" w:lineRule="auto"/>
         <w:ind w:left="590.3999984264374" w:hanging="360"/>
+        <w:rPr/>
       </w:pPr>
       <w:r>
         <w:rPr>
@@ -16953,6 +17093,11 @@
           <w:rtl w:val="0"/>
         </w:rPr>
         <w:t xml:space="preserve">36</w:t>
+      </w:r>
+      <w:r>
+        <w:rPr>
+          <w:rtl w:val="0"/>
+        </w:rPr>
       </w:r>
     </w:p>
     <w:p>
@@ -16971,6 +17116,7 @@
         <w:shd w:fill="auto" w:val="clear"/>
         <w:spacing w:line="275.9999942779541" w:lineRule="auto"/>
         <w:ind w:left="590.3999984264374" w:hanging="360"/>
+        <w:rPr/>
       </w:pPr>
       <w:r>
         <w:rPr>
@@ -16999,12 +17145,12 @@
           <wp:inline distB="19050" distT="19050" distL="19050" distR="19050">
             <wp:extent cx="1337472" cy="229281"/>
             <wp:effectExtent b="0" l="0" r="0" t="0"/>
-            <wp:docPr id="12" name="image9.png"/>
+            <wp:docPr id="12" name="image7.png"/>
             <a:graphic>
               <a:graphicData uri="http://schemas.openxmlformats.org/drawingml/2006/picture">
                 <pic:pic>
                   <pic:nvPicPr>
-                    <pic:cNvPr id="0" name="image9.png"/>
+                    <pic:cNvPr id="0" name="image7.png"/>
                     <pic:cNvPicPr preferRelativeResize="0"/>
                   </pic:nvPicPr>
                   <pic:blipFill>
@@ -17064,12 +17210,12 @@
           <wp:inline distB="19050" distT="19050" distL="19050" distR="19050">
             <wp:extent cx="1185272" cy="229407"/>
             <wp:effectExtent b="0" l="0" r="0" t="0"/>
-            <wp:docPr id="16" name="image10.png"/>
+            <wp:docPr id="16" name="image8.png"/>
             <a:graphic>
               <a:graphicData uri="http://schemas.openxmlformats.org/drawingml/2006/picture">
                 <pic:pic>
                   <pic:nvPicPr>
-                    <pic:cNvPr id="0" name="image10.png"/>
+                    <pic:cNvPr id="0" name="image8.png"/>
                     <pic:cNvPicPr preferRelativeResize="0"/>
                   </pic:nvPicPr>
                   <pic:blipFill>
@@ -17110,12 +17256,12 @@
           <wp:inline distB="19050" distT="19050" distL="19050" distR="19050">
             <wp:extent cx="358775" cy="230641"/>
             <wp:effectExtent b="0" l="0" r="0" t="0"/>
-            <wp:docPr id="14" name="image13.png"/>
+            <wp:docPr id="14" name="image15.png"/>
             <a:graphic>
               <a:graphicData uri="http://schemas.openxmlformats.org/drawingml/2006/picture">
                 <pic:pic>
                   <pic:nvPicPr>
-                    <pic:cNvPr id="0" name="image13.png"/>
+                    <pic:cNvPr id="0" name="image15.png"/>
                     <pic:cNvPicPr preferRelativeResize="0"/>
                   </pic:nvPicPr>
                   <pic:blipFill>
@@ -17156,12 +17302,12 @@
           <wp:inline distB="19050" distT="19050" distL="19050" distR="19050">
             <wp:extent cx="1337472" cy="229281"/>
             <wp:effectExtent b="0" l="0" r="0" t="0"/>
-            <wp:docPr id="11" name="image17.png"/>
+            <wp:docPr id="11" name="image13.png"/>
             <a:graphic>
               <a:graphicData uri="http://schemas.openxmlformats.org/drawingml/2006/picture">
                 <pic:pic>
                   <pic:nvPicPr>
-                    <pic:cNvPr id="0" name="image17.png"/>
+                    <pic:cNvPr id="0" name="image13.png"/>
                     <pic:cNvPicPr preferRelativeResize="0"/>
                   </pic:nvPicPr>
                   <pic:blipFill>
@@ -17204,6 +17350,11 @@
         </w:rPr>
         <w:t xml:space="preserve">2</w:t>
       </w:r>
+      <w:r>
+        <w:rPr>
+          <w:rtl w:val="0"/>
+        </w:rPr>
+      </w:r>
     </w:p>
     <w:p>
       <w:pPr>
@@ -17221,6 +17372,7 @@
         <w:shd w:fill="auto" w:val="clear"/>
         <w:spacing w:line="275.9999942779541" w:lineRule="auto"/>
         <w:ind w:left="590.3999984264374" w:hanging="360"/>
+        <w:rPr/>
       </w:pPr>
       <w:r>
         <w:rPr>
@@ -17287,6 +17439,11 @@
           <w:rtl w:val="0"/>
         </w:rPr>
         <w:t xml:space="preserve">2</w:t>
+      </w:r>
+      <w:r>
+        <w:rPr>
+          <w:rtl w:val="0"/>
+        </w:rPr>
       </w:r>
     </w:p>
     <w:p>
@@ -17444,6 +17601,7 @@
         </w:pBdr>
         <w:shd w:fill="auto" w:val="clear"/>
         <w:ind w:left="600" w:hanging="360"/>
+        <w:rPr/>
       </w:pPr>
       <w:r>
         <w:rPr>
@@ -17488,6 +17646,7 @@
         </w:pBdr>
         <w:shd w:fill="auto" w:val="clear"/>
         <w:ind w:left="600" w:hanging="360"/>
+        <w:rPr/>
       </w:pPr>
       <w:r>
         <w:rPr>
@@ -17497,6 +17656,11 @@
           <w:rtl w:val="0"/>
         </w:rPr>
         <w:t xml:space="preserve">Historial último chat micelia.txt</w:t>
+      </w:r>
+      <w:r>
+        <w:rPr>
+          <w:rtl w:val="0"/>
+        </w:rPr>
       </w:r>
     </w:p>
     <w:p>
@@ -17514,6 +17678,7 @@
         </w:pBdr>
         <w:shd w:fill="auto" w:val="clear"/>
         <w:ind w:left="600" w:hanging="360"/>
+        <w:rPr/>
       </w:pPr>
       <w:r>
         <w:rPr>
@@ -17558,6 +17723,7 @@
         </w:pBdr>
         <w:shd w:fill="auto" w:val="clear"/>
         <w:ind w:left="600" w:hanging="360"/>
+        <w:rPr/>
       </w:pPr>
       <w:r>
         <w:rPr>
@@ -17602,6 +17768,7 @@
         </w:pBdr>
         <w:shd w:fill="auto" w:val="clear"/>
         <w:ind w:left="600" w:hanging="360"/>
+        <w:rPr/>
       </w:pPr>
       <w:r>
         <w:rPr>
@@ -17646,6 +17813,7 @@
         </w:pBdr>
         <w:shd w:fill="auto" w:val="clear"/>
         <w:ind w:left="600" w:hanging="360"/>
+        <w:rPr/>
       </w:pPr>
       <w:r>
         <w:rPr>
@@ -17690,6 +17858,7 @@
         </w:pBdr>
         <w:shd w:fill="auto" w:val="clear"/>
         <w:ind w:left="600" w:hanging="360"/>
+        <w:rPr/>
       </w:pPr>
       <w:r>
         <w:rPr>
@@ -17734,6 +17903,7 @@
         </w:pBdr>
         <w:shd w:fill="auto" w:val="clear"/>
         <w:ind w:left="600" w:hanging="360"/>
+        <w:rPr/>
       </w:pPr>
       <w:r>
         <w:rPr>
@@ -17778,6 +17948,7 @@
         </w:pBdr>
         <w:shd w:fill="auto" w:val="clear"/>
         <w:ind w:left="600" w:hanging="360"/>
+        <w:rPr/>
       </w:pPr>
       <w:r>
         <w:rPr>
@@ -17822,6 +17993,7 @@
         </w:pBdr>
         <w:shd w:fill="auto" w:val="clear"/>
         <w:ind w:left="600" w:hanging="360"/>
+        <w:rPr/>
       </w:pPr>
       <w:r>
         <w:rPr>
@@ -17866,6 +18038,7 @@
         </w:pBdr>
         <w:shd w:fill="auto" w:val="clear"/>
         <w:ind w:left="600" w:hanging="360"/>
+        <w:rPr/>
       </w:pPr>
       <w:r>
         <w:rPr>
@@ -17910,6 +18083,7 @@
         </w:pBdr>
         <w:shd w:fill="auto" w:val="clear"/>
         <w:ind w:left="600" w:hanging="360"/>
+        <w:rPr/>
       </w:pPr>
       <w:r>
         <w:rPr>
@@ -17954,6 +18128,7 @@
         </w:pBdr>
         <w:shd w:fill="auto" w:val="clear"/>
         <w:ind w:left="600" w:hanging="360"/>
+        <w:rPr/>
       </w:pPr>
       <w:r>
         <w:rPr>
@@ -17998,6 +18173,7 @@
         </w:pBdr>
         <w:shd w:fill="auto" w:val="clear"/>
         <w:ind w:left="600" w:hanging="360"/>
+        <w:rPr/>
       </w:pPr>
       <w:r>
         <w:rPr>
@@ -18042,6 +18218,7 @@
         </w:pBdr>
         <w:shd w:fill="auto" w:val="clear"/>
         <w:ind w:left="600" w:hanging="360"/>
+        <w:rPr/>
       </w:pPr>
       <w:r>
         <w:rPr>
@@ -18086,6 +18263,7 @@
         </w:pBdr>
         <w:shd w:fill="auto" w:val="clear"/>
         <w:ind w:left="600" w:hanging="360"/>
+        <w:rPr/>
       </w:pPr>
       <w:r>
         <w:rPr>
@@ -18130,6 +18308,7 @@
         </w:pBdr>
         <w:shd w:fill="auto" w:val="clear"/>
         <w:ind w:left="600" w:hanging="360"/>
+        <w:rPr/>
       </w:pPr>
       <w:r>
         <w:rPr>
@@ -18174,6 +18353,7 @@
         </w:pBdr>
         <w:shd w:fill="auto" w:val="clear"/>
         <w:ind w:left="600" w:hanging="360"/>
+        <w:rPr/>
       </w:pPr>
       <w:r>
         <w:rPr>
@@ -18218,6 +18398,7 @@
         </w:pBdr>
         <w:shd w:fill="auto" w:val="clear"/>
         <w:ind w:left="600" w:hanging="360"/>
+        <w:rPr/>
       </w:pPr>
       <w:r>
         <w:rPr>
@@ -18262,6 +18443,7 @@
         </w:pBdr>
         <w:shd w:fill="auto" w:val="clear"/>
         <w:ind w:left="600" w:hanging="360"/>
+        <w:rPr/>
       </w:pPr>
       <w:r>
         <w:rPr>
@@ -18306,6 +18488,7 @@
         </w:pBdr>
         <w:shd w:fill="auto" w:val="clear"/>
         <w:ind w:left="600" w:hanging="360"/>
+        <w:rPr/>
       </w:pPr>
       <w:r>
         <w:rPr>
@@ -18350,6 +18533,7 @@
         </w:pBdr>
         <w:shd w:fill="auto" w:val="clear"/>
         <w:ind w:left="600" w:hanging="360"/>
+        <w:rPr/>
       </w:pPr>
       <w:r>
         <w:rPr>
@@ -18394,6 +18578,7 @@
         </w:pBdr>
         <w:shd w:fill="auto" w:val="clear"/>
         <w:ind w:left="600" w:hanging="360"/>
+        <w:rPr/>
       </w:pPr>
       <w:r>
         <w:rPr>
@@ -18438,6 +18623,7 @@
         </w:pBdr>
         <w:shd w:fill="auto" w:val="clear"/>
         <w:ind w:left="600" w:hanging="360"/>
+        <w:rPr/>
       </w:pPr>
       <w:r>
         <w:rPr>
@@ -18482,6 +18668,7 @@
         </w:pBdr>
         <w:shd w:fill="auto" w:val="clear"/>
         <w:ind w:left="600" w:hanging="360"/>
+        <w:rPr/>
       </w:pPr>
       <w:r>
         <w:rPr>
@@ -18526,6 +18713,7 @@
         </w:pBdr>
         <w:shd w:fill="auto" w:val="clear"/>
         <w:ind w:left="600" w:hanging="360"/>
+        <w:rPr/>
       </w:pPr>
       <w:r>
         <w:rPr>
@@ -18570,6 +18758,7 @@
         </w:pBdr>
         <w:shd w:fill="auto" w:val="clear"/>
         <w:ind w:left="600" w:hanging="360"/>
+        <w:rPr/>
       </w:pPr>
       <w:r>
         <w:rPr>
@@ -18614,6 +18803,7 @@
         </w:pBdr>
         <w:shd w:fill="auto" w:val="clear"/>
         <w:ind w:left="600" w:hanging="360"/>
+        <w:rPr/>
       </w:pPr>
       <w:r>
         <w:rPr>
@@ -18658,6 +18848,7 @@
         </w:pBdr>
         <w:shd w:fill="auto" w:val="clear"/>
         <w:ind w:left="600" w:hanging="360"/>
+        <w:rPr/>
       </w:pPr>
       <w:r>
         <w:rPr>
@@ -18702,6 +18893,7 @@
         </w:pBdr>
         <w:shd w:fill="auto" w:val="clear"/>
         <w:ind w:left="600" w:hanging="360"/>
+        <w:rPr/>
       </w:pPr>
       <w:r>
         <w:rPr>
@@ -18746,6 +18938,7 @@
         </w:pBdr>
         <w:shd w:fill="auto" w:val="clear"/>
         <w:ind w:left="600" w:hanging="360"/>
+        <w:rPr/>
       </w:pPr>
       <w:r>
         <w:rPr>
@@ -18790,6 +18983,7 @@
         </w:pBdr>
         <w:shd w:fill="auto" w:val="clear"/>
         <w:ind w:left="600" w:hanging="360"/>
+        <w:rPr/>
       </w:pPr>
       <w:r>
         <w:rPr>
@@ -18834,6 +19028,7 @@
         </w:pBdr>
         <w:shd w:fill="auto" w:val="clear"/>
         <w:ind w:left="600" w:hanging="360"/>
+        <w:rPr/>
       </w:pPr>
       <w:r>
         <w:rPr>
@@ -18878,6 +19073,7 @@
         </w:pBdr>
         <w:shd w:fill="auto" w:val="clear"/>
         <w:ind w:left="600" w:hanging="360"/>
+        <w:rPr/>
       </w:pPr>
       <w:r>
         <w:rPr>
@@ -18922,6 +19118,7 @@
         </w:pBdr>
         <w:shd w:fill="auto" w:val="clear"/>
         <w:ind w:left="600" w:hanging="360"/>
+        <w:rPr/>
       </w:pPr>
       <w:r>
         <w:rPr>
@@ -18966,6 +19163,7 @@
         </w:pBdr>
         <w:shd w:fill="auto" w:val="clear"/>
         <w:ind w:left="600" w:hanging="360"/>
+        <w:rPr/>
       </w:pPr>
       <w:r>
         <w:rPr>
@@ -19010,6 +19208,7 @@
         </w:pBdr>
         <w:shd w:fill="auto" w:val="clear"/>
         <w:ind w:left="600" w:hanging="360"/>
+        <w:rPr/>
       </w:pPr>
       <w:r>
         <w:rPr>
@@ -19054,6 +19253,7 @@
         </w:pBdr>
         <w:shd w:fill="auto" w:val="clear"/>
         <w:ind w:left="600" w:hanging="360"/>
+        <w:rPr/>
       </w:pPr>
       <w:r>
         <w:rPr>
@@ -19098,6 +19298,7 @@
         </w:pBdr>
         <w:shd w:fill="auto" w:val="clear"/>
         <w:ind w:left="600" w:hanging="360"/>
+        <w:rPr/>
       </w:pPr>
       <w:r>
         <w:rPr>
@@ -19142,6 +19343,7 @@
         </w:pBdr>
         <w:shd w:fill="auto" w:val="clear"/>
         <w:ind w:left="600" w:hanging="360"/>
+        <w:rPr/>
       </w:pPr>
       <w:r>
         <w:rPr>
@@ -19186,6 +19388,7 @@
         </w:pBdr>
         <w:shd w:fill="auto" w:val="clear"/>
         <w:ind w:left="600" w:hanging="360"/>
+        <w:rPr/>
       </w:pPr>
       <w:r>
         <w:rPr>
@@ -19230,6 +19433,7 @@
         </w:pBdr>
         <w:shd w:fill="auto" w:val="clear"/>
         <w:ind w:left="600" w:hanging="360"/>
+        <w:rPr/>
       </w:pPr>
       <w:r>
         <w:rPr>
@@ -19274,6 +19478,7 @@
         </w:pBdr>
         <w:shd w:fill="auto" w:val="clear"/>
         <w:ind w:left="600" w:hanging="360"/>
+        <w:rPr/>
       </w:pPr>
       <w:r>
         <w:rPr>
@@ -19318,6 +19523,7 @@
         </w:pBdr>
         <w:shd w:fill="auto" w:val="clear"/>
         <w:ind w:left="600" w:hanging="360"/>
+        <w:rPr/>
       </w:pPr>
       <w:r>
         <w:rPr>
@@ -19362,6 +19568,7 @@
         </w:pBdr>
         <w:shd w:fill="auto" w:val="clear"/>
         <w:ind w:left="600" w:hanging="360"/>
+        <w:rPr/>
       </w:pPr>
       <w:r>
         <w:rPr>
@@ -19406,6 +19613,7 @@
         </w:pBdr>
         <w:shd w:fill="auto" w:val="clear"/>
         <w:ind w:left="600" w:hanging="360"/>
+        <w:rPr/>
       </w:pPr>
       <w:r>
         <w:rPr>

</xml_diff>